<commit_message>
Updated DFD LVL 1 documents
Updated draw.io and text document to reflect most recent feedback from both 10-5-25 and 10-9-25.
</commit_message>
<xml_diff>
--- a/TEAM_2_PRODUCTION_SYSTEM_DFD_1_DRAFT.docx
+++ b/TEAM_2_PRODUCTION_SYSTEM_DFD_1_DRAFT.docx
@@ -107,10 +107,10 @@
           <w:noProof/>
         </w:rPr>
         <w:drawing>
-          <wp:inline distT="0" distB="0" distL="0" distR="0" wp14:anchorId="52767D03" wp14:editId="7B8E9DB4">
-            <wp:extent cx="5943600" cy="3482340"/>
-            <wp:effectExtent l="0" t="7620" r="0" b="0"/>
-            <wp:docPr id="180169832" name="Picture 1" descr="A diagram of a computer&#10;&#10;AI-generated content may be incorrect."/>
+          <wp:inline distT="0" distB="0" distL="0" distR="0" wp14:anchorId="1389DB56" wp14:editId="1DF20BBE">
+            <wp:extent cx="5943600" cy="4118610"/>
+            <wp:effectExtent l="0" t="0" r="0" b="0"/>
+            <wp:docPr id="395528250" name="Picture 1" descr="A diagram of a computer&#10;&#10;AI-generated content may be incorrect."/>
             <wp:cNvGraphicFramePr>
               <a:graphicFrameLocks xmlns:a="http://schemas.openxmlformats.org/drawingml/2006/main" noChangeAspect="1"/>
             </wp:cNvGraphicFramePr>
@@ -118,7 +118,7 @@
               <a:graphicData uri="http://schemas.openxmlformats.org/drawingml/2006/picture">
                 <pic:pic xmlns:pic="http://schemas.openxmlformats.org/drawingml/2006/picture">
                   <pic:nvPicPr>
-                    <pic:cNvPr id="180169832" name="Picture 1" descr="A diagram of a computer&#10;&#10;AI-generated content may be incorrect."/>
+                    <pic:cNvPr id="395528250" name="Picture 1" descr="A diagram of a computer&#10;&#10;AI-generated content may be incorrect."/>
                     <pic:cNvPicPr/>
                   </pic:nvPicPr>
                   <pic:blipFill>
@@ -136,7 +136,7 @@
                   <pic:spPr>
                     <a:xfrm>
                       <a:off x="0" y="0"/>
-                      <a:ext cx="5943600" cy="3482340"/>
+                      <a:ext cx="5943600" cy="4118610"/>
                     </a:xfrm>
                     <a:prstGeom prst="rect">
                       <a:avLst/>
@@ -148,50 +148,6 @@
           </wp:inline>
         </w:drawing>
       </w:r>
-    </w:p>
-    <w:p>
-      <w:pPr>
-        <w:spacing w:after="0" w:line="240" w:lineRule="auto"/>
-        <w:jc w:val="center"/>
-        <w:rPr>
-          <w:rFonts w:ascii="Times New Roman" w:hAnsi="Times New Roman" w:cs="Times New Roman"/>
-          <w:b/>
-          <w:bCs/>
-        </w:rPr>
-      </w:pPr>
-    </w:p>
-    <w:p>
-      <w:pPr>
-        <w:spacing w:after="0" w:line="240" w:lineRule="auto"/>
-        <w:jc w:val="center"/>
-        <w:rPr>
-          <w:rFonts w:ascii="Times New Roman" w:hAnsi="Times New Roman" w:cs="Times New Roman"/>
-          <w:b/>
-          <w:bCs/>
-        </w:rPr>
-      </w:pPr>
-    </w:p>
-    <w:p>
-      <w:pPr>
-        <w:spacing w:after="0" w:line="240" w:lineRule="auto"/>
-        <w:jc w:val="center"/>
-        <w:rPr>
-          <w:rFonts w:ascii="Times New Roman" w:hAnsi="Times New Roman" w:cs="Times New Roman"/>
-          <w:b/>
-          <w:bCs/>
-        </w:rPr>
-      </w:pPr>
-    </w:p>
-    <w:p>
-      <w:pPr>
-        <w:spacing w:after="0" w:line="240" w:lineRule="auto"/>
-        <w:jc w:val="center"/>
-        <w:rPr>
-          <w:rFonts w:ascii="Times New Roman" w:hAnsi="Times New Roman" w:cs="Times New Roman"/>
-          <w:b/>
-          <w:bCs/>
-        </w:rPr>
-      </w:pPr>
     </w:p>
     <w:p>
       <w:pPr>
@@ -553,7 +509,37 @@
               <w:rPr>
                 <w:rFonts w:ascii="Times New Roman" w:hAnsi="Times New Roman" w:cs="Times New Roman"/>
               </w:rPr>
-              <w:t>Authenticate managers through user and role verification to grant role-based action privileges on the PART_HISTORY table.</w:t>
+              <w:t xml:space="preserve">Authenticate </w:t>
+            </w:r>
+            <w:r>
+              <w:rPr>
+                <w:rFonts w:ascii="Times New Roman" w:hAnsi="Times New Roman" w:cs="Times New Roman"/>
+              </w:rPr>
+              <w:t xml:space="preserve">department </w:t>
+            </w:r>
+            <w:r>
+              <w:rPr>
+                <w:rFonts w:ascii="Times New Roman" w:hAnsi="Times New Roman" w:cs="Times New Roman"/>
+              </w:rPr>
+              <w:t>manager</w:t>
+            </w:r>
+            <w:r>
+              <w:rPr>
+                <w:rFonts w:ascii="Times New Roman" w:hAnsi="Times New Roman" w:cs="Times New Roman"/>
+              </w:rPr>
+              <w:t xml:space="preserve"> user interfaces</w:t>
+            </w:r>
+            <w:r>
+              <w:rPr>
+                <w:rFonts w:ascii="Times New Roman" w:hAnsi="Times New Roman" w:cs="Times New Roman"/>
+              </w:rPr>
+              <w:t xml:space="preserve"> through user and role verification to grant role-based action privileges on the</w:t>
+            </w:r>
+            <w:r>
+              <w:rPr>
+                <w:rFonts w:ascii="Times New Roman" w:hAnsi="Times New Roman" w:cs="Times New Roman"/>
+              </w:rPr>
+              <w:t xml:space="preserve"> PART_HISTORY table within the database.</w:t>
             </w:r>
           </w:p>
         </w:tc>
@@ -716,13 +702,6 @@
           </w:p>
           <w:p>
             <w:pPr>
-              <w:rPr>
-                <w:rFonts w:ascii="Times New Roman" w:hAnsi="Times New Roman" w:cs="Times New Roman"/>
-              </w:rPr>
-            </w:pPr>
-          </w:p>
-          <w:p>
-            <w:pPr>
               <w:pStyle w:val="ListParagraph"/>
               <w:numPr>
                 <w:ilvl w:val="0"/>
@@ -756,7 +735,13 @@
               <w:rPr>
                 <w:rFonts w:ascii="Times New Roman" w:hAnsi="Times New Roman" w:cs="Times New Roman"/>
               </w:rPr>
-              <w:t>RECEIVE the DEPARTMENT MANAGER AND USER AUTHENTICATION from the system where the PART_HISTORY table is located.</w:t>
+              <w:t xml:space="preserve">RECEIVE the DEPARTMENT MANAGER AND USER AUTHENTICATION from the </w:t>
+            </w:r>
+            <w:r>
+              <w:rPr>
+                <w:rFonts w:ascii="Times New Roman" w:hAnsi="Times New Roman" w:cs="Times New Roman"/>
+              </w:rPr>
+              <w:t>DEPARTMENT USER INTERFACE.</w:t>
             </w:r>
           </w:p>
           <w:p>
@@ -796,27 +781,39 @@
               <w:rPr>
                 <w:rFonts w:ascii="Times New Roman" w:hAnsi="Times New Roman" w:cs="Times New Roman"/>
               </w:rPr>
-              <w:t>RECEIVE USER APPROVED &amp; ROLE ACCESS GRANTED from the ACTIVE DIRECTORY entity.</w:t>
-            </w:r>
-          </w:p>
-          <w:p>
-            <w:pPr>
-              <w:rPr>
-                <w:rFonts w:ascii="Times New Roman" w:hAnsi="Times New Roman" w:cs="Times New Roman"/>
-              </w:rPr>
-            </w:pPr>
-          </w:p>
-          <w:p>
-            <w:pPr>
-              <w:rPr>
-                <w:rFonts w:ascii="Times New Roman" w:hAnsi="Times New Roman" w:cs="Times New Roman"/>
-              </w:rPr>
-            </w:pPr>
-            <w:r>
-              <w:rPr>
-                <w:rFonts w:ascii="Times New Roman" w:hAnsi="Times New Roman" w:cs="Times New Roman"/>
-              </w:rPr>
-              <w:t>SEND the AUTHENTICATION SUCCESS ACCESS APPROVAL to the system where the PART_HISTORY table is located.</w:t>
+              <w:t>RECEIVE USER APPROVED &amp; ROLE ACCESS GRANTED from the ACTIVE DIRECTORY</w:t>
+            </w:r>
+            <w:r>
+              <w:rPr>
+                <w:rFonts w:ascii="Times New Roman" w:hAnsi="Times New Roman" w:cs="Times New Roman"/>
+              </w:rPr>
+              <w:t>.</w:t>
+            </w:r>
+          </w:p>
+          <w:p>
+            <w:pPr>
+              <w:rPr>
+                <w:rFonts w:ascii="Times New Roman" w:hAnsi="Times New Roman" w:cs="Times New Roman"/>
+              </w:rPr>
+            </w:pPr>
+          </w:p>
+          <w:p>
+            <w:pPr>
+              <w:rPr>
+                <w:rFonts w:ascii="Times New Roman" w:hAnsi="Times New Roman" w:cs="Times New Roman"/>
+              </w:rPr>
+            </w:pPr>
+            <w:r>
+              <w:rPr>
+                <w:rFonts w:ascii="Times New Roman" w:hAnsi="Times New Roman" w:cs="Times New Roman"/>
+              </w:rPr>
+              <w:t xml:space="preserve">SEND the AUTHENTICATION SUCCESS ACCESS APPROVAL to the </w:t>
+            </w:r>
+            <w:r>
+              <w:rPr>
+                <w:rFonts w:ascii="Times New Roman" w:hAnsi="Times New Roman" w:cs="Times New Roman"/>
+              </w:rPr>
+              <w:t>DEPARTMENT USER INTERFACE.</w:t>
             </w:r>
           </w:p>
         </w:tc>
@@ -864,6 +861,17 @@
         </w:tc>
       </w:tr>
     </w:tbl>
+    <w:p>
+      <w:pPr>
+        <w:spacing w:after="0" w:line="240" w:lineRule="auto"/>
+        <w:jc w:val="center"/>
+        <w:rPr>
+          <w:rFonts w:ascii="Times New Roman" w:hAnsi="Times New Roman" w:cs="Times New Roman"/>
+          <w:b/>
+          <w:bCs/>
+        </w:rPr>
+      </w:pPr>
+    </w:p>
     <w:p>
       <w:pPr>
         <w:spacing w:after="0" w:line="240" w:lineRule="auto"/>
@@ -1185,13 +1193,12 @@
               </w:rPr>
               <w:t>Query the system to search by parameters such as PART NUMBER, DUE DATE RANGE, OPERATOR NAME, and DEPARTMENT. Receive the query results from the system which returns CUSTOMER_NAME, OPERATOR_NAME, PART_NUMBER, QTY, DATE_RECEIVED, DATE_DUE, OPERATIONS, and PURCHASE_ORDER_NUMBER</w:t>
             </w:r>
-          </w:p>
-          <w:p>
-            <w:pPr>
-              <w:rPr>
-                <w:rFonts w:ascii="Times New Roman" w:hAnsi="Times New Roman" w:cs="Times New Roman"/>
-              </w:rPr>
-            </w:pPr>
+            <w:r>
+              <w:rPr>
+                <w:rFonts w:ascii="Times New Roman" w:hAnsi="Times New Roman" w:cs="Times New Roman"/>
+              </w:rPr>
+              <w:t>.</w:t>
+            </w:r>
           </w:p>
         </w:tc>
       </w:tr>
@@ -1292,7 +1299,79 @@
               <w:rPr>
                 <w:rFonts w:ascii="Times New Roman" w:hAnsi="Times New Roman" w:cs="Times New Roman"/>
               </w:rPr>
-              <w:t>SEARCH BY: PART NUMBER, DUE DATE RANGE, OPERATOR NAME, DEPARTMENT.</w:t>
+              <w:t>SEARCH CRITERIA:</w:t>
+            </w:r>
+          </w:p>
+          <w:p>
+            <w:pPr>
+              <w:pStyle w:val="ListParagraph"/>
+              <w:numPr>
+                <w:ilvl w:val="0"/>
+                <w:numId w:val="11"/>
+              </w:numPr>
+              <w:rPr>
+                <w:rFonts w:ascii="Times New Roman" w:hAnsi="Times New Roman" w:cs="Times New Roman"/>
+              </w:rPr>
+            </w:pPr>
+            <w:r>
+              <w:rPr>
+                <w:rFonts w:ascii="Times New Roman" w:hAnsi="Times New Roman" w:cs="Times New Roman"/>
+              </w:rPr>
+              <w:t xml:space="preserve">PART NUMBER </w:t>
+            </w:r>
+          </w:p>
+          <w:p>
+            <w:pPr>
+              <w:pStyle w:val="ListParagraph"/>
+              <w:numPr>
+                <w:ilvl w:val="0"/>
+                <w:numId w:val="11"/>
+              </w:numPr>
+              <w:rPr>
+                <w:rFonts w:ascii="Times New Roman" w:hAnsi="Times New Roman" w:cs="Times New Roman"/>
+              </w:rPr>
+            </w:pPr>
+            <w:r>
+              <w:rPr>
+                <w:rFonts w:ascii="Times New Roman" w:hAnsi="Times New Roman" w:cs="Times New Roman"/>
+              </w:rPr>
+              <w:t xml:space="preserve">DUE DATE RANGE </w:t>
+            </w:r>
+          </w:p>
+          <w:p>
+            <w:pPr>
+              <w:pStyle w:val="ListParagraph"/>
+              <w:numPr>
+                <w:ilvl w:val="0"/>
+                <w:numId w:val="11"/>
+              </w:numPr>
+              <w:rPr>
+                <w:rFonts w:ascii="Times New Roman" w:hAnsi="Times New Roman" w:cs="Times New Roman"/>
+              </w:rPr>
+            </w:pPr>
+            <w:r>
+              <w:rPr>
+                <w:rFonts w:ascii="Times New Roman" w:hAnsi="Times New Roman" w:cs="Times New Roman"/>
+              </w:rPr>
+              <w:t xml:space="preserve">OPERATOR NAME </w:t>
+            </w:r>
+          </w:p>
+          <w:p>
+            <w:pPr>
+              <w:pStyle w:val="ListParagraph"/>
+              <w:numPr>
+                <w:ilvl w:val="0"/>
+                <w:numId w:val="11"/>
+              </w:numPr>
+              <w:rPr>
+                <w:rFonts w:ascii="Times New Roman" w:hAnsi="Times New Roman" w:cs="Times New Roman"/>
+              </w:rPr>
+            </w:pPr>
+            <w:r>
+              <w:rPr>
+                <w:rFonts w:ascii="Times New Roman" w:hAnsi="Times New Roman" w:cs="Times New Roman"/>
+              </w:rPr>
+              <w:t>DEPARTMENT.</w:t>
             </w:r>
           </w:p>
           <w:p>
@@ -1319,13 +1398,6 @@
                 <w:rFonts w:ascii="Times New Roman" w:hAnsi="Times New Roman" w:cs="Times New Roman"/>
               </w:rPr>
             </w:pPr>
-          </w:p>
-          <w:p>
-            <w:pPr>
-              <w:rPr>
-                <w:rFonts w:ascii="Times New Roman" w:hAnsi="Times New Roman" w:cs="Times New Roman"/>
-              </w:rPr>
-            </w:pPr>
             <w:r>
               <w:rPr>
                 <w:rFonts w:ascii="Times New Roman" w:hAnsi="Times New Roman" w:cs="Times New Roman"/>
@@ -1366,7 +1438,151 @@
               <w:rPr>
                 <w:rFonts w:ascii="Times New Roman" w:hAnsi="Times New Roman" w:cs="Times New Roman"/>
               </w:rPr>
-              <w:t>SEARCH RESULTS: CUSTOMER_NAME, OPERATOR_NAME, PART_NUMBER, QTY, DATE_RECEIVED, DATE_DUE, OPERATIONS, PURCHASE_ORDER_NUMBER</w:t>
+              <w:t xml:space="preserve">SEARCH RESULTS: </w:t>
+            </w:r>
+          </w:p>
+          <w:p>
+            <w:pPr>
+              <w:pStyle w:val="ListParagraph"/>
+              <w:numPr>
+                <w:ilvl w:val="0"/>
+                <w:numId w:val="11"/>
+              </w:numPr>
+              <w:rPr>
+                <w:rFonts w:ascii="Times New Roman" w:hAnsi="Times New Roman" w:cs="Times New Roman"/>
+              </w:rPr>
+            </w:pPr>
+            <w:r>
+              <w:rPr>
+                <w:rFonts w:ascii="Times New Roman" w:hAnsi="Times New Roman" w:cs="Times New Roman"/>
+              </w:rPr>
+              <w:t>CUSTOMER_NAME</w:t>
+            </w:r>
+            <w:r>
+              <w:rPr>
+                <w:rFonts w:ascii="Times New Roman" w:hAnsi="Times New Roman" w:cs="Times New Roman"/>
+              </w:rPr>
+              <w:t>,</w:t>
+            </w:r>
+            <w:r>
+              <w:rPr>
+                <w:rFonts w:ascii="Times New Roman" w:hAnsi="Times New Roman" w:cs="Times New Roman"/>
+              </w:rPr>
+              <w:t xml:space="preserve"> </w:t>
+            </w:r>
+            <w:r>
+              <w:rPr>
+                <w:rFonts w:ascii="Times New Roman" w:hAnsi="Times New Roman" w:cs="Times New Roman"/>
+              </w:rPr>
+              <w:t>OPERATOR_NAME</w:t>
+            </w:r>
+          </w:p>
+          <w:p>
+            <w:pPr>
+              <w:pStyle w:val="ListParagraph"/>
+              <w:numPr>
+                <w:ilvl w:val="0"/>
+                <w:numId w:val="11"/>
+              </w:numPr>
+              <w:rPr>
+                <w:rFonts w:ascii="Times New Roman" w:hAnsi="Times New Roman" w:cs="Times New Roman"/>
+              </w:rPr>
+            </w:pPr>
+            <w:r>
+              <w:rPr>
+                <w:rFonts w:ascii="Times New Roman" w:hAnsi="Times New Roman" w:cs="Times New Roman"/>
+              </w:rPr>
+              <w:t>PART_NUMBER</w:t>
+            </w:r>
+            <w:r>
+              <w:rPr>
+                <w:rFonts w:ascii="Times New Roman" w:hAnsi="Times New Roman" w:cs="Times New Roman"/>
+              </w:rPr>
+              <w:t xml:space="preserve">, </w:t>
+            </w:r>
+            <w:r>
+              <w:rPr>
+                <w:rFonts w:ascii="Times New Roman" w:hAnsi="Times New Roman" w:cs="Times New Roman"/>
+              </w:rPr>
+              <w:t>QTY</w:t>
+            </w:r>
+          </w:p>
+          <w:p>
+            <w:pPr>
+              <w:pStyle w:val="ListParagraph"/>
+              <w:numPr>
+                <w:ilvl w:val="0"/>
+                <w:numId w:val="11"/>
+              </w:numPr>
+              <w:rPr>
+                <w:rFonts w:ascii="Times New Roman" w:hAnsi="Times New Roman" w:cs="Times New Roman"/>
+              </w:rPr>
+            </w:pPr>
+            <w:r>
+              <w:rPr>
+                <w:rFonts w:ascii="Times New Roman" w:hAnsi="Times New Roman" w:cs="Times New Roman"/>
+              </w:rPr>
+              <w:t>DATE_RECEIVED</w:t>
+            </w:r>
+            <w:r>
+              <w:rPr>
+                <w:rFonts w:ascii="Times New Roman" w:hAnsi="Times New Roman" w:cs="Times New Roman"/>
+              </w:rPr>
+              <w:t xml:space="preserve">, </w:t>
+            </w:r>
+            <w:r>
+              <w:rPr>
+                <w:rFonts w:ascii="Times New Roman" w:hAnsi="Times New Roman" w:cs="Times New Roman"/>
+              </w:rPr>
+              <w:t>DATE_DUE</w:t>
+            </w:r>
+          </w:p>
+          <w:p>
+            <w:pPr>
+              <w:pStyle w:val="ListParagraph"/>
+              <w:numPr>
+                <w:ilvl w:val="0"/>
+                <w:numId w:val="11"/>
+              </w:numPr>
+              <w:rPr>
+                <w:rFonts w:ascii="Times New Roman" w:hAnsi="Times New Roman" w:cs="Times New Roman"/>
+              </w:rPr>
+            </w:pPr>
+            <w:r>
+              <w:rPr>
+                <w:rFonts w:ascii="Times New Roman" w:hAnsi="Times New Roman" w:cs="Times New Roman"/>
+              </w:rPr>
+              <w:t>OPERATIONS</w:t>
+            </w:r>
+            <w:r>
+              <w:rPr>
+                <w:rFonts w:ascii="Times New Roman" w:hAnsi="Times New Roman" w:cs="Times New Roman"/>
+              </w:rPr>
+              <w:t xml:space="preserve">, </w:t>
+            </w:r>
+            <w:r>
+              <w:rPr>
+                <w:rFonts w:ascii="Times New Roman" w:hAnsi="Times New Roman" w:cs="Times New Roman"/>
+              </w:rPr>
+              <w:t>PURCHASE_ORDER_NUMBER</w:t>
+            </w:r>
+          </w:p>
+          <w:p>
+            <w:pPr>
+              <w:pStyle w:val="ListParagraph"/>
+              <w:numPr>
+                <w:ilvl w:val="0"/>
+                <w:numId w:val="4"/>
+              </w:numPr>
+              <w:rPr>
+                <w:rFonts w:ascii="Times New Roman" w:hAnsi="Times New Roman" w:cs="Times New Roman"/>
+              </w:rPr>
+            </w:pPr>
+            <w:r>
+              <w:rPr>
+                <w:rFonts w:ascii="Times New Roman" w:hAnsi="Times New Roman" w:cs="Times New Roman"/>
+              </w:rPr>
+              <w:t>INPUT VALIDATION ERROR MESSAGE</w:t>
             </w:r>
           </w:p>
           <w:p>
@@ -1392,7 +1608,31 @@
               <w:rPr>
                 <w:rFonts w:ascii="Times New Roman" w:hAnsi="Times New Roman" w:cs="Times New Roman"/>
               </w:rPr>
-              <w:t>the SEARCH BY: PART NUMBER, DUE DATE RANGE, OPERATOR NAME, and DEPARTMENT request from the QUALITY &amp; SHIPPING DEPARTMENTS entity.</w:t>
+              <w:t>the SEARCH</w:t>
+            </w:r>
+            <w:r>
+              <w:rPr>
+                <w:rFonts w:ascii="Times New Roman" w:hAnsi="Times New Roman" w:cs="Times New Roman"/>
+              </w:rPr>
+              <w:t xml:space="preserve"> CRITERIA</w:t>
+            </w:r>
+            <w:r>
+              <w:rPr>
+                <w:rFonts w:ascii="Times New Roman" w:hAnsi="Times New Roman" w:cs="Times New Roman"/>
+              </w:rPr>
+              <w:t xml:space="preserve"> from the </w:t>
+            </w:r>
+            <w:r>
+              <w:rPr>
+                <w:rFonts w:ascii="Times New Roman" w:hAnsi="Times New Roman" w:cs="Times New Roman"/>
+              </w:rPr>
+              <w:t xml:space="preserve">DEPARTMENT USER INTERFACES </w:t>
+            </w:r>
+            <w:r>
+              <w:rPr>
+                <w:rFonts w:ascii="Times New Roman" w:hAnsi="Times New Roman" w:cs="Times New Roman"/>
+              </w:rPr>
+              <w:t>entity.</w:t>
             </w:r>
           </w:p>
           <w:p>
@@ -1424,7 +1664,19 @@
               <w:rPr>
                 <w:rFonts w:ascii="Times New Roman" w:hAnsi="Times New Roman" w:cs="Times New Roman"/>
               </w:rPr>
-              <w:t>SQL SELECT QUERY (READ REQUESTS) to the system where the PART_HISTORY table is located.</w:t>
+              <w:t xml:space="preserve">SQL SELECT QUERY (READ REQUESTS) to the </w:t>
+            </w:r>
+            <w:r>
+              <w:rPr>
+                <w:rFonts w:ascii="Times New Roman" w:hAnsi="Times New Roman" w:cs="Times New Roman"/>
+              </w:rPr>
+              <w:t>PRODUCTION DATA DATABASE</w:t>
+            </w:r>
+            <w:r>
+              <w:rPr>
+                <w:rFonts w:ascii="Times New Roman" w:hAnsi="Times New Roman" w:cs="Times New Roman"/>
+              </w:rPr>
+              <w:t xml:space="preserve"> where the PART_HISTORY table is located.</w:t>
             </w:r>
           </w:p>
           <w:p>
@@ -1450,7 +1702,19 @@
               <w:rPr>
                 <w:rFonts w:ascii="Times New Roman" w:hAnsi="Times New Roman" w:cs="Times New Roman"/>
               </w:rPr>
-              <w:t>the SQL SELECT QUERY RESULTS (READ ACKNOWLEDGEMENTS) from the system where the PART_HISTORY table is located.</w:t>
+              <w:t xml:space="preserve">the SQL SELECT QUERY RESULTS (READ ACKNOWLEDGEMENTS) from the </w:t>
+            </w:r>
+            <w:r>
+              <w:rPr>
+                <w:rFonts w:ascii="Times New Roman" w:hAnsi="Times New Roman" w:cs="Times New Roman"/>
+              </w:rPr>
+              <w:t>PRODUCTION DATA DATABASE</w:t>
+            </w:r>
+            <w:r>
+              <w:rPr>
+                <w:rFonts w:ascii="Times New Roman" w:hAnsi="Times New Roman" w:cs="Times New Roman"/>
+              </w:rPr>
+              <w:t xml:space="preserve"> where the PART_HISTORY table is located.</w:t>
             </w:r>
           </w:p>
           <w:p>
@@ -1476,15 +1740,64 @@
               <w:rPr>
                 <w:rFonts w:ascii="Times New Roman" w:hAnsi="Times New Roman" w:cs="Times New Roman"/>
               </w:rPr>
-              <w:t>SEARCH RESULTS: CUSTOMER_NAME, OPERATOR_NAME, PART_NUMBER, QTY, DATE_RECEIVED, DATE_DUE, OPERATONS, and PURCHASE_ORDER_NUMBER to the QUALITY &amp; SHIPPING DEPARTMENTS entity.</w:t>
-            </w:r>
-          </w:p>
-          <w:p>
-            <w:pPr>
-              <w:rPr>
-                <w:rFonts w:ascii="Times New Roman" w:hAnsi="Times New Roman" w:cs="Times New Roman"/>
-              </w:rPr>
-            </w:pPr>
+              <w:t>SEARCH RESULTS</w:t>
+            </w:r>
+            <w:r>
+              <w:rPr>
+                <w:rFonts w:ascii="Times New Roman" w:hAnsi="Times New Roman" w:cs="Times New Roman"/>
+              </w:rPr>
+              <w:t xml:space="preserve"> </w:t>
+            </w:r>
+            <w:r>
+              <w:rPr>
+                <w:rFonts w:ascii="Times New Roman" w:hAnsi="Times New Roman" w:cs="Times New Roman"/>
+              </w:rPr>
+              <w:t xml:space="preserve">to the </w:t>
+            </w:r>
+            <w:r>
+              <w:rPr>
+                <w:rFonts w:ascii="Times New Roman" w:hAnsi="Times New Roman" w:cs="Times New Roman"/>
+              </w:rPr>
+              <w:t>DEPARTMENT USER INTERFACES entity</w:t>
+            </w:r>
+            <w:r>
+              <w:rPr>
+                <w:rFonts w:ascii="Times New Roman" w:hAnsi="Times New Roman" w:cs="Times New Roman"/>
+              </w:rPr>
+              <w:t>.</w:t>
+            </w:r>
+          </w:p>
+          <w:p>
+            <w:pPr>
+              <w:rPr>
+                <w:rFonts w:ascii="Times New Roman" w:hAnsi="Times New Roman" w:cs="Times New Roman"/>
+              </w:rPr>
+            </w:pPr>
+          </w:p>
+          <w:p>
+            <w:pPr>
+              <w:rPr>
+                <w:rFonts w:ascii="Times New Roman" w:hAnsi="Times New Roman" w:cs="Times New Roman"/>
+              </w:rPr>
+            </w:pPr>
+            <w:r>
+              <w:rPr>
+                <w:rFonts w:ascii="Times New Roman" w:hAnsi="Times New Roman" w:cs="Times New Roman"/>
+              </w:rPr>
+              <w:t xml:space="preserve">SEND the INPUT VALIDATION ERROR MESSAGE to the DEPARTMENT USER INTERFACES entity when SEARCH CRITERIA </w:t>
+            </w:r>
+            <w:r>
+              <w:rPr>
+                <w:rFonts w:ascii="Times New Roman" w:hAnsi="Times New Roman" w:cs="Times New Roman"/>
+              </w:rPr>
+              <w:t xml:space="preserve">required field </w:t>
+            </w:r>
+            <w:r>
+              <w:rPr>
+                <w:rFonts w:ascii="Times New Roman" w:hAnsi="Times New Roman" w:cs="Times New Roman"/>
+              </w:rPr>
+              <w:t>input fails validation constraints.</w:t>
+            </w:r>
           </w:p>
         </w:tc>
       </w:tr>
@@ -1540,51 +1853,46 @@
     <w:p>
       <w:pPr>
         <w:spacing w:after="0" w:line="240" w:lineRule="auto"/>
-        <w:jc w:val="center"/>
-        <w:rPr>
-          <w:rFonts w:ascii="Times New Roman" w:hAnsi="Times New Roman" w:cs="Times New Roman"/>
-          <w:b/>
-          <w:bCs/>
-        </w:rPr>
-      </w:pPr>
-    </w:p>
-    <w:p>
-      <w:pPr>
-        <w:spacing w:after="0" w:line="240" w:lineRule="auto"/>
-        <w:jc w:val="center"/>
-        <w:rPr>
-          <w:rFonts w:ascii="Times New Roman" w:hAnsi="Times New Roman" w:cs="Times New Roman"/>
-          <w:b/>
-          <w:bCs/>
-        </w:rPr>
-      </w:pPr>
-    </w:p>
-    <w:p>
-      <w:pPr>
-        <w:spacing w:after="0" w:line="240" w:lineRule="auto"/>
-        <w:jc w:val="center"/>
-        <w:rPr>
-          <w:rFonts w:ascii="Times New Roman" w:hAnsi="Times New Roman" w:cs="Times New Roman"/>
-          <w:b/>
-          <w:bCs/>
-        </w:rPr>
-      </w:pPr>
-    </w:p>
-    <w:p>
-      <w:pPr>
-        <w:spacing w:after="0" w:line="240" w:lineRule="auto"/>
-        <w:jc w:val="center"/>
-        <w:rPr>
-          <w:rFonts w:ascii="Times New Roman" w:hAnsi="Times New Roman" w:cs="Times New Roman"/>
-          <w:b/>
-          <w:bCs/>
-        </w:rPr>
-      </w:pPr>
-    </w:p>
-    <w:p>
-      <w:pPr>
-        <w:spacing w:after="0" w:line="240" w:lineRule="auto"/>
-        <w:jc w:val="center"/>
+        <w:rPr>
+          <w:rFonts w:ascii="Times New Roman" w:hAnsi="Times New Roman" w:cs="Times New Roman"/>
+          <w:b/>
+          <w:bCs/>
+        </w:rPr>
+      </w:pPr>
+    </w:p>
+    <w:p>
+      <w:pPr>
+        <w:spacing w:after="0" w:line="240" w:lineRule="auto"/>
+        <w:rPr>
+          <w:rFonts w:ascii="Times New Roman" w:hAnsi="Times New Roman" w:cs="Times New Roman"/>
+          <w:b/>
+          <w:bCs/>
+        </w:rPr>
+      </w:pPr>
+    </w:p>
+    <w:p>
+      <w:pPr>
+        <w:spacing w:after="0" w:line="240" w:lineRule="auto"/>
+        <w:rPr>
+          <w:rFonts w:ascii="Times New Roman" w:hAnsi="Times New Roman" w:cs="Times New Roman"/>
+          <w:b/>
+          <w:bCs/>
+        </w:rPr>
+      </w:pPr>
+    </w:p>
+    <w:p>
+      <w:pPr>
+        <w:spacing w:after="0" w:line="240" w:lineRule="auto"/>
+        <w:rPr>
+          <w:rFonts w:ascii="Times New Roman" w:hAnsi="Times New Roman" w:cs="Times New Roman"/>
+          <w:b/>
+          <w:bCs/>
+        </w:rPr>
+      </w:pPr>
+    </w:p>
+    <w:p>
+      <w:pPr>
+        <w:spacing w:after="0" w:line="240" w:lineRule="auto"/>
         <w:rPr>
           <w:rFonts w:ascii="Times New Roman" w:hAnsi="Times New Roman" w:cs="Times New Roman"/>
           <w:b/>
@@ -1631,7 +1939,6 @@
                 <w:b/>
                 <w:bCs/>
               </w:rPr>
-              <w:lastRenderedPageBreak/>
               <w:t>Label:</w:t>
             </w:r>
           </w:p>
@@ -1650,7 +1957,7 @@
               <w:rPr>
                 <w:rFonts w:ascii="Times New Roman" w:hAnsi="Times New Roman" w:cs="Times New Roman"/>
               </w:rPr>
-              <w:t>VIEW PRODUCTION RECORDS</w:t>
+              <w:t>MODIFY PRODUCTION RECORDS</w:t>
             </w:r>
           </w:p>
         </w:tc>
@@ -1734,15 +2041,14 @@
               <w:rPr>
                 <w:rFonts w:ascii="Times New Roman" w:hAnsi="Times New Roman" w:cs="Times New Roman"/>
               </w:rPr>
-              <w:t>Query the system to search by parameters such as PART NUMBER, DUE DATE RANGE, OPERATOR NAME, and DEPARTMENT. Receive the query results from the system which returns CUSTOMER_NAME, OPERATOR_NAME, PART_NUMBER, QTY, DATE_RECEIVED, DATE_DUE, OPERATIONS, and PURCHASE_ORDER_NUMBER</w:t>
-            </w:r>
-          </w:p>
-          <w:p>
-            <w:pPr>
-              <w:rPr>
-                <w:rFonts w:ascii="Times New Roman" w:hAnsi="Times New Roman" w:cs="Times New Roman"/>
-              </w:rPr>
-            </w:pPr>
+              <w:t xml:space="preserve">Query the system to </w:t>
+            </w:r>
+            <w:r>
+              <w:rPr>
+                <w:rFonts w:ascii="Times New Roman" w:hAnsi="Times New Roman" w:cs="Times New Roman"/>
+              </w:rPr>
+              <w:t>CREATE new records, UPDATE existing records, and (soft) DELETE existing records.</w:t>
+            </w:r>
           </w:p>
         </w:tc>
       </w:tr>
@@ -1833,7 +2139,7 @@
               <w:pStyle w:val="ListParagraph"/>
               <w:numPr>
                 <w:ilvl w:val="0"/>
-                <w:numId w:val="6"/>
+                <w:numId w:val="10"/>
               </w:numPr>
               <w:rPr>
                 <w:rFonts w:ascii="Times New Roman" w:hAnsi="Times New Roman" w:cs="Times New Roman"/>
@@ -1843,7 +2149,7 @@
               <w:rPr>
                 <w:rFonts w:ascii="Times New Roman" w:hAnsi="Times New Roman" w:cs="Times New Roman"/>
               </w:rPr>
-              <w:t>SEARCH BY: PART NUMBER, DUE DATE RANGE, OPERATOR NAME, DEPARTMENT.</w:t>
+              <w:t>WO C/U/D REQUEST</w:t>
             </w:r>
           </w:p>
           <w:p>
@@ -1851,7 +2157,7 @@
               <w:pStyle w:val="ListParagraph"/>
               <w:numPr>
                 <w:ilvl w:val="0"/>
-                <w:numId w:val="6"/>
+                <w:numId w:val="10"/>
               </w:numPr>
               <w:rPr>
                 <w:rFonts w:ascii="Times New Roman" w:hAnsi="Times New Roman" w:cs="Times New Roman"/>
@@ -1861,15 +2167,8 @@
               <w:rPr>
                 <w:rFonts w:ascii="Times New Roman" w:hAnsi="Times New Roman" w:cs="Times New Roman"/>
               </w:rPr>
-              <w:t>SQL SELECT QUERY RESULTS (READ ACKNOWLEDGEMENTS)</w:t>
-            </w:r>
-          </w:p>
-          <w:p>
-            <w:pPr>
-              <w:rPr>
-                <w:rFonts w:ascii="Times New Roman" w:hAnsi="Times New Roman" w:cs="Times New Roman"/>
-              </w:rPr>
-            </w:pPr>
+              <w:t>INSERT, UPDATE, DELETE QUERY SUCCESS</w:t>
+            </w:r>
           </w:p>
           <w:p>
             <w:pPr>
@@ -1889,7 +2188,7 @@
               <w:pStyle w:val="ListParagraph"/>
               <w:numPr>
                 <w:ilvl w:val="0"/>
-                <w:numId w:val="7"/>
+                <w:numId w:val="9"/>
               </w:numPr>
               <w:rPr>
                 <w:rFonts w:ascii="Times New Roman" w:hAnsi="Times New Roman" w:cs="Times New Roman"/>
@@ -1899,7 +2198,13 @@
               <w:rPr>
                 <w:rFonts w:ascii="Times New Roman" w:hAnsi="Times New Roman" w:cs="Times New Roman"/>
               </w:rPr>
-              <w:t>SQL SELECT QUERY (READ REQUESTS)</w:t>
+              <w:t>INSERT, UPDATE, DELETE QUER</w:t>
+            </w:r>
+            <w:r>
+              <w:rPr>
+                <w:rFonts w:ascii="Times New Roman" w:hAnsi="Times New Roman" w:cs="Times New Roman"/>
+              </w:rPr>
+              <w:t>Y</w:t>
             </w:r>
           </w:p>
           <w:p>
@@ -1907,7 +2212,7 @@
               <w:pStyle w:val="ListParagraph"/>
               <w:numPr>
                 <w:ilvl w:val="0"/>
-                <w:numId w:val="7"/>
+                <w:numId w:val="9"/>
               </w:numPr>
               <w:rPr>
                 <w:rFonts w:ascii="Times New Roman" w:hAnsi="Times New Roman" w:cs="Times New Roman"/>
@@ -1917,95 +2222,168 @@
               <w:rPr>
                 <w:rFonts w:ascii="Times New Roman" w:hAnsi="Times New Roman" w:cs="Times New Roman"/>
               </w:rPr>
-              <w:t>SEARCH RESULTS: CUSTOMER_NAME, OPERATOR_NAME, PART_NUMBER, QTY, DATE_RECEIVED, DATE_DUE, OPERATIONS, PURCHASE_ORDER_NUMBER</w:t>
-            </w:r>
-          </w:p>
-          <w:p>
-            <w:pPr>
-              <w:rPr>
-                <w:rFonts w:ascii="Times New Roman" w:hAnsi="Times New Roman" w:cs="Times New Roman"/>
-              </w:rPr>
-            </w:pPr>
-          </w:p>
-          <w:p>
-            <w:pPr>
-              <w:rPr>
-                <w:rFonts w:ascii="Times New Roman" w:hAnsi="Times New Roman" w:cs="Times New Roman"/>
-              </w:rPr>
-            </w:pPr>
-            <w:r>
-              <w:rPr>
-                <w:rFonts w:ascii="Times New Roman" w:hAnsi="Times New Roman" w:cs="Times New Roman"/>
-              </w:rPr>
-              <w:t>RECEIVE the SEARCH BY: PART NUMBER, DUE DATE RANGE, OPERATOR NAME, and DEPARTMENT request from the FABRICATION &amp; MACHINE SHOP DEPARTMENTS entity.</w:t>
-            </w:r>
-          </w:p>
-          <w:p>
-            <w:pPr>
-              <w:rPr>
-                <w:rFonts w:ascii="Times New Roman" w:hAnsi="Times New Roman" w:cs="Times New Roman"/>
-              </w:rPr>
-            </w:pPr>
-          </w:p>
-          <w:p>
-            <w:pPr>
-              <w:rPr>
-                <w:rFonts w:ascii="Times New Roman" w:hAnsi="Times New Roman" w:cs="Times New Roman"/>
-              </w:rPr>
-            </w:pPr>
-            <w:r>
-              <w:rPr>
-                <w:rFonts w:ascii="Times New Roman" w:hAnsi="Times New Roman" w:cs="Times New Roman"/>
-              </w:rPr>
-              <w:t>SEND the SQL SELECT QUERY (READ REQUESTS) to the system where the PART_HISTORY table is located.</w:t>
-            </w:r>
-          </w:p>
-          <w:p>
-            <w:pPr>
-              <w:rPr>
-                <w:rFonts w:ascii="Times New Roman" w:hAnsi="Times New Roman" w:cs="Times New Roman"/>
-              </w:rPr>
-            </w:pPr>
-          </w:p>
-          <w:p>
-            <w:pPr>
-              <w:rPr>
-                <w:rFonts w:ascii="Times New Roman" w:hAnsi="Times New Roman" w:cs="Times New Roman"/>
-              </w:rPr>
-            </w:pPr>
-            <w:r>
-              <w:rPr>
-                <w:rFonts w:ascii="Times New Roman" w:hAnsi="Times New Roman" w:cs="Times New Roman"/>
-              </w:rPr>
-              <w:t>RECEIVE the SQL SELECT QUERY RESULTS (READ ACKNOWLEDGEMENTS) from the system where the PART_HISTORY table is located.</w:t>
-            </w:r>
-          </w:p>
-          <w:p>
-            <w:pPr>
-              <w:rPr>
-                <w:rFonts w:ascii="Times New Roman" w:hAnsi="Times New Roman" w:cs="Times New Roman"/>
-              </w:rPr>
-            </w:pPr>
-          </w:p>
-          <w:p>
-            <w:pPr>
-              <w:rPr>
-                <w:rFonts w:ascii="Times New Roman" w:hAnsi="Times New Roman" w:cs="Times New Roman"/>
-              </w:rPr>
-            </w:pPr>
-            <w:r>
-              <w:rPr>
-                <w:rFonts w:ascii="Times New Roman" w:hAnsi="Times New Roman" w:cs="Times New Roman"/>
-              </w:rPr>
-              <w:t>SEND the SEARCH RESULTS: CUSTOMER_NAME, OPERATOR_NAME, PART_NUMBER, QTY, DATE_RECEIVED, DATE_DUE, OPERATONS, and PURCHASE_ORDER_NUMBER to the FABRICATION &amp; MACHINE SHOP DEPARTMENTS entity.</w:t>
-            </w:r>
-          </w:p>
-          <w:p>
-            <w:pPr>
-              <w:rPr>
-                <w:rFonts w:ascii="Times New Roman" w:hAnsi="Times New Roman" w:cs="Times New Roman"/>
-              </w:rPr>
-            </w:pPr>
+              <w:t>WO C/U/D ACKNOWLEDGEMENTS</w:t>
+            </w:r>
+          </w:p>
+          <w:p>
+            <w:pPr>
+              <w:pStyle w:val="ListParagraph"/>
+              <w:numPr>
+                <w:ilvl w:val="0"/>
+                <w:numId w:val="9"/>
+              </w:numPr>
+              <w:rPr>
+                <w:rFonts w:ascii="Times New Roman" w:hAnsi="Times New Roman" w:cs="Times New Roman"/>
+              </w:rPr>
+            </w:pPr>
+            <w:r>
+              <w:rPr>
+                <w:rFonts w:ascii="Times New Roman" w:hAnsi="Times New Roman" w:cs="Times New Roman"/>
+              </w:rPr>
+              <w:t>INPUT VALIDATION ERROR MESSAGE</w:t>
+            </w:r>
+          </w:p>
+          <w:p>
+            <w:pPr>
+              <w:rPr>
+                <w:rFonts w:ascii="Times New Roman" w:hAnsi="Times New Roman" w:cs="Times New Roman"/>
+              </w:rPr>
+            </w:pPr>
+          </w:p>
+          <w:p>
+            <w:pPr>
+              <w:rPr>
+                <w:rFonts w:ascii="Times New Roman" w:hAnsi="Times New Roman" w:cs="Times New Roman"/>
+              </w:rPr>
+            </w:pPr>
+            <w:r>
+              <w:rPr>
+                <w:rFonts w:ascii="Times New Roman" w:hAnsi="Times New Roman" w:cs="Times New Roman"/>
+              </w:rPr>
+              <w:t xml:space="preserve">RECEIVE the </w:t>
+            </w:r>
+            <w:r>
+              <w:rPr>
+                <w:rFonts w:ascii="Times New Roman" w:hAnsi="Times New Roman" w:cs="Times New Roman"/>
+              </w:rPr>
+              <w:t>WO C/U/D REQUEST from the DEPARTMENT USER INTERFACES entity</w:t>
+            </w:r>
+            <w:r>
+              <w:rPr>
+                <w:rFonts w:ascii="Times New Roman" w:hAnsi="Times New Roman" w:cs="Times New Roman"/>
+              </w:rPr>
+              <w:t>.</w:t>
+            </w:r>
+          </w:p>
+          <w:p>
+            <w:pPr>
+              <w:rPr>
+                <w:rFonts w:ascii="Times New Roman" w:hAnsi="Times New Roman" w:cs="Times New Roman"/>
+              </w:rPr>
+            </w:pPr>
+          </w:p>
+          <w:p>
+            <w:pPr>
+              <w:rPr>
+                <w:rFonts w:ascii="Times New Roman" w:hAnsi="Times New Roman" w:cs="Times New Roman"/>
+              </w:rPr>
+            </w:pPr>
+            <w:r>
+              <w:rPr>
+                <w:rFonts w:ascii="Times New Roman" w:hAnsi="Times New Roman" w:cs="Times New Roman"/>
+              </w:rPr>
+              <w:t>SEND the INSERT, UPDATE, DELETE QUER</w:t>
+            </w:r>
+            <w:r>
+              <w:rPr>
+                <w:rFonts w:ascii="Times New Roman" w:hAnsi="Times New Roman" w:cs="Times New Roman"/>
+              </w:rPr>
+              <w:t>Y</w:t>
+            </w:r>
+            <w:r>
+              <w:rPr>
+                <w:rFonts w:ascii="Times New Roman" w:hAnsi="Times New Roman" w:cs="Times New Roman"/>
+              </w:rPr>
+              <w:t xml:space="preserve"> </w:t>
+            </w:r>
+            <w:r>
+              <w:rPr>
+                <w:rFonts w:ascii="Times New Roman" w:hAnsi="Times New Roman" w:cs="Times New Roman"/>
+              </w:rPr>
+              <w:t>to the PRODUCTION DATA DATABASE.</w:t>
+            </w:r>
+          </w:p>
+          <w:p>
+            <w:pPr>
+              <w:rPr>
+                <w:rFonts w:ascii="Times New Roman" w:hAnsi="Times New Roman" w:cs="Times New Roman"/>
+              </w:rPr>
+            </w:pPr>
+          </w:p>
+          <w:p>
+            <w:pPr>
+              <w:rPr>
+                <w:rFonts w:ascii="Times New Roman" w:hAnsi="Times New Roman" w:cs="Times New Roman"/>
+              </w:rPr>
+            </w:pPr>
+            <w:r>
+              <w:rPr>
+                <w:rFonts w:ascii="Times New Roman" w:hAnsi="Times New Roman" w:cs="Times New Roman"/>
+              </w:rPr>
+              <w:t>RECEIVE the INSERT, UPDATE, DELETE QUERY SUCCESS notice from the PRODUCTION DATA DATABASE.</w:t>
+            </w:r>
+          </w:p>
+          <w:p>
+            <w:pPr>
+              <w:rPr>
+                <w:rFonts w:ascii="Times New Roman" w:hAnsi="Times New Roman" w:cs="Times New Roman"/>
+              </w:rPr>
+            </w:pPr>
+          </w:p>
+          <w:p>
+            <w:pPr>
+              <w:rPr>
+                <w:rFonts w:ascii="Times New Roman" w:hAnsi="Times New Roman" w:cs="Times New Roman"/>
+              </w:rPr>
+            </w:pPr>
+            <w:r>
+              <w:rPr>
+                <w:rFonts w:ascii="Times New Roman" w:hAnsi="Times New Roman" w:cs="Times New Roman"/>
+              </w:rPr>
+              <w:t>SEND the WO C/U/D ACKNOWLEDGEMENTS to the DEPARTMENT USER INTERFACES entity.</w:t>
+            </w:r>
+          </w:p>
+          <w:p>
+            <w:pPr>
+              <w:rPr>
+                <w:rFonts w:ascii="Times New Roman" w:hAnsi="Times New Roman" w:cs="Times New Roman"/>
+              </w:rPr>
+            </w:pPr>
+          </w:p>
+          <w:p>
+            <w:pPr>
+              <w:rPr>
+                <w:rFonts w:ascii="Times New Roman" w:hAnsi="Times New Roman" w:cs="Times New Roman"/>
+              </w:rPr>
+            </w:pPr>
+            <w:r>
+              <w:rPr>
+                <w:rFonts w:ascii="Times New Roman" w:hAnsi="Times New Roman" w:cs="Times New Roman"/>
+              </w:rPr>
+              <w:t xml:space="preserve">SEND the INPUT VALIDATION ERROR MESSAGE to the DEPARTMENT USER INTERFACES entity when </w:t>
+            </w:r>
+            <w:r>
+              <w:rPr>
+                <w:rFonts w:ascii="Times New Roman" w:hAnsi="Times New Roman" w:cs="Times New Roman"/>
+              </w:rPr>
+              <w:t>WO C/U/D REQUEST required field</w:t>
+            </w:r>
+            <w:r>
+              <w:rPr>
+                <w:rFonts w:ascii="Times New Roman" w:hAnsi="Times New Roman" w:cs="Times New Roman"/>
+              </w:rPr>
+              <w:t xml:space="preserve"> input fails validation constraints.</w:t>
+            </w:r>
           </w:p>
         </w:tc>
       </w:tr>
@@ -2052,445 +2430,19 @@
               <w:rPr>
                 <w:rFonts w:ascii="Times New Roman" w:hAnsi="Times New Roman" w:cs="Times New Roman"/>
               </w:rPr>
-              <w:t>process 3.</w:t>
-            </w:r>
-          </w:p>
-        </w:tc>
-      </w:tr>
-    </w:tbl>
-    <w:p>
-      <w:pPr>
-        <w:spacing w:after="0" w:line="240" w:lineRule="auto"/>
-        <w:jc w:val="center"/>
-        <w:rPr>
-          <w:rFonts w:ascii="Times New Roman" w:hAnsi="Times New Roman" w:cs="Times New Roman"/>
-          <w:b/>
-          <w:bCs/>
-        </w:rPr>
-      </w:pPr>
-    </w:p>
-    <w:p>
-      <w:pPr>
-        <w:spacing w:after="0" w:line="240" w:lineRule="auto"/>
-        <w:jc w:val="center"/>
-        <w:rPr>
-          <w:rFonts w:ascii="Times New Roman" w:hAnsi="Times New Roman" w:cs="Times New Roman"/>
-          <w:b/>
-          <w:bCs/>
-        </w:rPr>
-      </w:pPr>
-    </w:p>
-    <w:p>
-      <w:pPr>
-        <w:spacing w:after="0" w:line="240" w:lineRule="auto"/>
-        <w:jc w:val="center"/>
-        <w:rPr>
-          <w:rFonts w:ascii="Times New Roman" w:hAnsi="Times New Roman" w:cs="Times New Roman"/>
-          <w:b/>
-          <w:bCs/>
-        </w:rPr>
-      </w:pPr>
-    </w:p>
-    <w:p>
-      <w:pPr>
-        <w:spacing w:after="0" w:line="240" w:lineRule="auto"/>
-        <w:jc w:val="center"/>
-        <w:rPr>
-          <w:rFonts w:ascii="Times New Roman" w:hAnsi="Times New Roman" w:cs="Times New Roman"/>
-          <w:b/>
-          <w:bCs/>
-        </w:rPr>
-      </w:pPr>
-    </w:p>
-    <w:p>
-      <w:pPr>
-        <w:spacing w:after="0" w:line="240" w:lineRule="auto"/>
-        <w:jc w:val="center"/>
-        <w:rPr>
-          <w:rFonts w:ascii="Times New Roman" w:hAnsi="Times New Roman" w:cs="Times New Roman"/>
-          <w:b/>
-          <w:bCs/>
-        </w:rPr>
-      </w:pPr>
-    </w:p>
-    <w:p>
-      <w:pPr>
-        <w:spacing w:after="0" w:line="240" w:lineRule="auto"/>
-        <w:jc w:val="center"/>
-        <w:rPr>
-          <w:rFonts w:ascii="Times New Roman" w:hAnsi="Times New Roman" w:cs="Times New Roman"/>
-          <w:b/>
-          <w:bCs/>
-        </w:rPr>
-      </w:pPr>
-    </w:p>
-    <w:tbl>
-      <w:tblPr>
-        <w:tblStyle w:val="TableGrid"/>
-        <w:tblW w:w="0" w:type="auto"/>
-        <w:tblLook w:val="04A0" w:firstRow="1" w:lastRow="0" w:firstColumn="1" w:lastColumn="0" w:noHBand="0" w:noVBand="1"/>
-      </w:tblPr>
-      <w:tblGrid>
-        <w:gridCol w:w="2335"/>
-        <w:gridCol w:w="7015"/>
-      </w:tblGrid>
-      <w:tr>
-        <w:tc>
-          <w:tcPr>
-            <w:tcW w:w="2335" w:type="dxa"/>
-          </w:tcPr>
-          <w:p>
-            <w:pPr>
-              <w:rPr>
-                <w:rFonts w:ascii="Times New Roman" w:hAnsi="Times New Roman" w:cs="Times New Roman"/>
-                <w:b/>
-                <w:bCs/>
-              </w:rPr>
-            </w:pPr>
-            <w:r>
-              <w:rPr>
-                <w:rFonts w:ascii="Times New Roman" w:hAnsi="Times New Roman" w:cs="Times New Roman"/>
-                <w:b/>
-                <w:bCs/>
-              </w:rPr>
-              <w:lastRenderedPageBreak/>
-              <w:t>Label:</w:t>
-            </w:r>
-          </w:p>
-        </w:tc>
-        <w:tc>
-          <w:tcPr>
-            <w:tcW w:w="7015" w:type="dxa"/>
-          </w:tcPr>
-          <w:p>
-            <w:pPr>
-              <w:rPr>
-                <w:rFonts w:ascii="Times New Roman" w:hAnsi="Times New Roman" w:cs="Times New Roman"/>
-              </w:rPr>
-            </w:pPr>
-            <w:r>
-              <w:rPr>
-                <w:rFonts w:ascii="Times New Roman" w:hAnsi="Times New Roman" w:cs="Times New Roman"/>
-              </w:rPr>
-              <w:t>MODIFY PRODUCTION RECORDS</w:t>
-            </w:r>
-          </w:p>
-        </w:tc>
-      </w:tr>
-      <w:tr>
-        <w:tc>
-          <w:tcPr>
-            <w:tcW w:w="2335" w:type="dxa"/>
-          </w:tcPr>
-          <w:p>
-            <w:pPr>
-              <w:rPr>
-                <w:rFonts w:ascii="Times New Roman" w:hAnsi="Times New Roman" w:cs="Times New Roman"/>
-                <w:b/>
-                <w:bCs/>
-              </w:rPr>
-            </w:pPr>
-            <w:r>
-              <w:rPr>
-                <w:rFonts w:ascii="Times New Roman" w:hAnsi="Times New Roman" w:cs="Times New Roman"/>
-                <w:b/>
-                <w:bCs/>
-              </w:rPr>
-              <w:t>Entry Type:</w:t>
-            </w:r>
-          </w:p>
-        </w:tc>
-        <w:tc>
-          <w:tcPr>
-            <w:tcW w:w="7015" w:type="dxa"/>
-          </w:tcPr>
-          <w:p>
-            <w:pPr>
-              <w:rPr>
-                <w:rFonts w:ascii="Times New Roman" w:hAnsi="Times New Roman" w:cs="Times New Roman"/>
-              </w:rPr>
-            </w:pPr>
-            <w:r>
-              <w:rPr>
-                <w:rFonts w:ascii="Times New Roman" w:hAnsi="Times New Roman" w:cs="Times New Roman"/>
-              </w:rPr>
-              <w:t>Process</w:t>
-            </w:r>
-          </w:p>
-        </w:tc>
-      </w:tr>
-      <w:tr>
-        <w:tc>
-          <w:tcPr>
-            <w:tcW w:w="2335" w:type="dxa"/>
-          </w:tcPr>
-          <w:p>
-            <w:pPr>
-              <w:rPr>
-                <w:rFonts w:ascii="Times New Roman" w:hAnsi="Times New Roman" w:cs="Times New Roman"/>
-                <w:b/>
-                <w:bCs/>
-              </w:rPr>
-            </w:pPr>
-            <w:r>
-              <w:rPr>
-                <w:rFonts w:ascii="Times New Roman" w:hAnsi="Times New Roman" w:cs="Times New Roman"/>
-                <w:b/>
-                <w:bCs/>
-              </w:rPr>
-              <w:t>Description:</w:t>
-            </w:r>
-          </w:p>
-        </w:tc>
-        <w:tc>
-          <w:tcPr>
-            <w:tcW w:w="7015" w:type="dxa"/>
-          </w:tcPr>
-          <w:p>
-            <w:pPr>
-              <w:rPr>
-                <w:rFonts w:ascii="Times New Roman" w:hAnsi="Times New Roman" w:cs="Times New Roman"/>
-              </w:rPr>
-            </w:pPr>
-            <w:r>
-              <w:rPr>
-                <w:rFonts w:ascii="Times New Roman" w:hAnsi="Times New Roman" w:cs="Times New Roman"/>
-              </w:rPr>
-              <w:t xml:space="preserve">Query the system to </w:t>
-            </w:r>
-            <w:r>
-              <w:rPr>
-                <w:rFonts w:ascii="Times New Roman" w:hAnsi="Times New Roman" w:cs="Times New Roman"/>
-              </w:rPr>
-              <w:t>CREATE new records, UPDATE existing records, and (soft) DELETE existing records.</w:t>
-            </w:r>
-          </w:p>
-          <w:p>
-            <w:pPr>
-              <w:rPr>
-                <w:rFonts w:ascii="Times New Roman" w:hAnsi="Times New Roman" w:cs="Times New Roman"/>
-              </w:rPr>
-            </w:pPr>
-          </w:p>
-        </w:tc>
-      </w:tr>
-      <w:tr>
-        <w:tc>
-          <w:tcPr>
-            <w:tcW w:w="2335" w:type="dxa"/>
-          </w:tcPr>
-          <w:p>
-            <w:pPr>
-              <w:rPr>
-                <w:rFonts w:ascii="Times New Roman" w:hAnsi="Times New Roman" w:cs="Times New Roman"/>
-                <w:b/>
-                <w:bCs/>
-              </w:rPr>
-            </w:pPr>
-            <w:r>
-              <w:rPr>
-                <w:rFonts w:ascii="Times New Roman" w:hAnsi="Times New Roman" w:cs="Times New Roman"/>
-                <w:b/>
-                <w:bCs/>
-              </w:rPr>
-              <w:t>Process #:</w:t>
-            </w:r>
-          </w:p>
-        </w:tc>
-        <w:tc>
-          <w:tcPr>
-            <w:tcW w:w="7015" w:type="dxa"/>
-          </w:tcPr>
-          <w:p>
-            <w:pPr>
-              <w:rPr>
-                <w:rFonts w:ascii="Times New Roman" w:hAnsi="Times New Roman" w:cs="Times New Roman"/>
-              </w:rPr>
-            </w:pPr>
-            <w:r>
-              <w:rPr>
-                <w:rFonts w:ascii="Times New Roman" w:hAnsi="Times New Roman" w:cs="Times New Roman"/>
-              </w:rPr>
-              <w:t>4</w:t>
-            </w:r>
-          </w:p>
-        </w:tc>
-      </w:tr>
-      <w:tr>
-        <w:tc>
-          <w:tcPr>
-            <w:tcW w:w="2335" w:type="dxa"/>
-          </w:tcPr>
-          <w:p>
-            <w:pPr>
-              <w:rPr>
-                <w:rFonts w:ascii="Times New Roman" w:hAnsi="Times New Roman" w:cs="Times New Roman"/>
-                <w:b/>
-                <w:bCs/>
-              </w:rPr>
-            </w:pPr>
-            <w:r>
-              <w:rPr>
-                <w:rFonts w:ascii="Times New Roman" w:hAnsi="Times New Roman" w:cs="Times New Roman"/>
-                <w:b/>
-                <w:bCs/>
-              </w:rPr>
-              <w:t>Process Description:</w:t>
-            </w:r>
-          </w:p>
-        </w:tc>
-        <w:tc>
-          <w:tcPr>
-            <w:tcW w:w="7015" w:type="dxa"/>
-          </w:tcPr>
-          <w:p>
-            <w:pPr>
-              <w:rPr>
-                <w:rFonts w:ascii="Times New Roman" w:hAnsi="Times New Roman" w:cs="Times New Roman"/>
-              </w:rPr>
-            </w:pPr>
-            <w:r>
-              <w:rPr>
-                <w:rFonts w:ascii="Times New Roman" w:hAnsi="Times New Roman" w:cs="Times New Roman"/>
-              </w:rPr>
-              <w:t>Input Data Flows:</w:t>
-            </w:r>
-          </w:p>
-          <w:p>
-            <w:pPr>
-              <w:pStyle w:val="ListParagraph"/>
-              <w:numPr>
-                <w:ilvl w:val="0"/>
-                <w:numId w:val="10"/>
-              </w:numPr>
-              <w:rPr>
-                <w:rFonts w:ascii="Times New Roman" w:hAnsi="Times New Roman" w:cs="Times New Roman"/>
-              </w:rPr>
-            </w:pPr>
-            <w:r>
-              <w:rPr>
-                <w:rFonts w:ascii="Times New Roman" w:hAnsi="Times New Roman" w:cs="Times New Roman"/>
-              </w:rPr>
-              <w:t>CREATE NEW RECORD, UPDATE RECORD, DELETE RECORD</w:t>
-            </w:r>
-          </w:p>
-          <w:p>
-            <w:pPr>
-              <w:rPr>
-                <w:rFonts w:ascii="Times New Roman" w:hAnsi="Times New Roman" w:cs="Times New Roman"/>
-              </w:rPr>
-            </w:pPr>
-            <w:r>
-              <w:rPr>
-                <w:rFonts w:ascii="Times New Roman" w:hAnsi="Times New Roman" w:cs="Times New Roman"/>
-              </w:rPr>
-              <w:t>Output Data Flows:</w:t>
-            </w:r>
-          </w:p>
-          <w:p>
-            <w:pPr>
-              <w:pStyle w:val="ListParagraph"/>
-              <w:numPr>
-                <w:ilvl w:val="0"/>
-                <w:numId w:val="9"/>
-              </w:numPr>
-              <w:rPr>
-                <w:rFonts w:ascii="Times New Roman" w:hAnsi="Times New Roman" w:cs="Times New Roman"/>
-              </w:rPr>
-            </w:pPr>
-            <w:r>
-              <w:rPr>
-                <w:rFonts w:ascii="Times New Roman" w:hAnsi="Times New Roman" w:cs="Times New Roman"/>
-              </w:rPr>
-              <w:t>INSERT, UPDATE, DELETE QUERIES (CREATE, UPDATE, DELETE REQUESTS)</w:t>
-            </w:r>
-          </w:p>
-          <w:p>
-            <w:pPr>
-              <w:rPr>
-                <w:rFonts w:ascii="Times New Roman" w:hAnsi="Times New Roman" w:cs="Times New Roman"/>
-              </w:rPr>
-            </w:pPr>
-          </w:p>
-          <w:p>
-            <w:pPr>
-              <w:rPr>
-                <w:rFonts w:ascii="Times New Roman" w:hAnsi="Times New Roman" w:cs="Times New Roman"/>
-              </w:rPr>
-            </w:pPr>
-            <w:r>
-              <w:rPr>
-                <w:rFonts w:ascii="Times New Roman" w:hAnsi="Times New Roman" w:cs="Times New Roman"/>
-              </w:rPr>
-              <w:t>RECEIVE the CREATE NEW RECORD, UPDATE RECORD, DELETE RECORD request.</w:t>
-            </w:r>
-          </w:p>
-          <w:p>
-            <w:pPr>
-              <w:rPr>
-                <w:rFonts w:ascii="Times New Roman" w:hAnsi="Times New Roman" w:cs="Times New Roman"/>
-              </w:rPr>
-            </w:pPr>
-          </w:p>
-          <w:p>
-            <w:pPr>
-              <w:rPr>
-                <w:rFonts w:ascii="Times New Roman" w:hAnsi="Times New Roman" w:cs="Times New Roman"/>
-              </w:rPr>
-            </w:pPr>
-            <w:r>
-              <w:rPr>
-                <w:rFonts w:ascii="Times New Roman" w:hAnsi="Times New Roman" w:cs="Times New Roman"/>
-              </w:rPr>
-              <w:t>SEND the INSERT, UPDATE, DELETE QUERIES (CREATE, UPDATE, DELETE REQUESTS) to the system where the PART_HISTORY table is located.</w:t>
-            </w:r>
-          </w:p>
-        </w:tc>
-      </w:tr>
-      <w:tr>
-        <w:tc>
-          <w:tcPr>
-            <w:tcW w:w="2335" w:type="dxa"/>
-          </w:tcPr>
-          <w:p>
-            <w:pPr>
-              <w:rPr>
-                <w:rFonts w:ascii="Times New Roman" w:hAnsi="Times New Roman" w:cs="Times New Roman"/>
-                <w:b/>
-                <w:bCs/>
-              </w:rPr>
-            </w:pPr>
-            <w:r>
-              <w:rPr>
-                <w:rFonts w:ascii="Times New Roman" w:hAnsi="Times New Roman" w:cs="Times New Roman"/>
-                <w:b/>
-                <w:bCs/>
-              </w:rPr>
-              <w:t>Notes:</w:t>
-            </w:r>
-          </w:p>
-        </w:tc>
-        <w:tc>
-          <w:tcPr>
-            <w:tcW w:w="7015" w:type="dxa"/>
-          </w:tcPr>
-          <w:p>
-            <w:pPr>
-              <w:rPr>
-                <w:rFonts w:ascii="Times New Roman" w:hAnsi="Times New Roman" w:cs="Times New Roman"/>
-              </w:rPr>
-            </w:pPr>
-            <w:r>
-              <w:rPr>
-                <w:rFonts w:ascii="Times New Roman" w:hAnsi="Times New Roman" w:cs="Times New Roman"/>
-              </w:rPr>
-              <w:t xml:space="preserve">Process 1 must take place before </w:t>
-            </w:r>
-            <w:r>
-              <w:rPr>
-                <w:rFonts w:ascii="Times New Roman" w:hAnsi="Times New Roman" w:cs="Times New Roman"/>
-              </w:rPr>
-              <w:t>process 4.</w:t>
+              <w:t xml:space="preserve">process </w:t>
+            </w:r>
+            <w:r>
+              <w:rPr>
+                <w:rFonts w:ascii="Times New Roman" w:hAnsi="Times New Roman" w:cs="Times New Roman"/>
+              </w:rPr>
+              <w:t>3</w:t>
+            </w:r>
+            <w:r>
+              <w:rPr>
+                <w:rFonts w:ascii="Times New Roman" w:hAnsi="Times New Roman" w:cs="Times New Roman"/>
+              </w:rPr>
+              <w:t>.</w:t>
             </w:r>
           </w:p>
         </w:tc>
@@ -3054,6 +3006,118 @@
     </w:lvl>
   </w:abstractNum>
   <w:abstractNum w:abstractNumId="6" w15:restartNumberingAfterBreak="0">
+    <w:nsid w:val="4AFE3CF9"/>
+    <w:multiLevelType w:val="hybridMultilevel"/>
+    <w:tmpl w:val="3CD2D4F0"/>
+    <w:lvl w:ilvl="0" w:tplc="F454F298">
+      <w:numFmt w:val="bullet"/>
+      <w:lvlText w:val="-"/>
+      <w:lvlJc w:val="left"/>
+      <w:pPr>
+        <w:ind w:left="1080" w:hanging="360"/>
+      </w:pPr>
+      <w:rPr>
+        <w:rFonts w:ascii="Times New Roman" w:eastAsiaTheme="minorHAnsi" w:hAnsi="Times New Roman" w:cs="Times New Roman" w:hint="default"/>
+      </w:rPr>
+    </w:lvl>
+    <w:lvl w:ilvl="1" w:tplc="04090003" w:tentative="1">
+      <w:start w:val="1"/>
+      <w:numFmt w:val="bullet"/>
+      <w:lvlText w:val="o"/>
+      <w:lvlJc w:val="left"/>
+      <w:pPr>
+        <w:ind w:left="1800" w:hanging="360"/>
+      </w:pPr>
+      <w:rPr>
+        <w:rFonts w:ascii="Courier New" w:hAnsi="Courier New" w:cs="Courier New" w:hint="default"/>
+      </w:rPr>
+    </w:lvl>
+    <w:lvl w:ilvl="2" w:tplc="04090005" w:tentative="1">
+      <w:start w:val="1"/>
+      <w:numFmt w:val="bullet"/>
+      <w:lvlText w:val=""/>
+      <w:lvlJc w:val="left"/>
+      <w:pPr>
+        <w:ind w:left="2520" w:hanging="360"/>
+      </w:pPr>
+      <w:rPr>
+        <w:rFonts w:ascii="Wingdings" w:hAnsi="Wingdings" w:hint="default"/>
+      </w:rPr>
+    </w:lvl>
+    <w:lvl w:ilvl="3" w:tplc="04090001" w:tentative="1">
+      <w:start w:val="1"/>
+      <w:numFmt w:val="bullet"/>
+      <w:lvlText w:val=""/>
+      <w:lvlJc w:val="left"/>
+      <w:pPr>
+        <w:ind w:left="3240" w:hanging="360"/>
+      </w:pPr>
+      <w:rPr>
+        <w:rFonts w:ascii="Symbol" w:hAnsi="Symbol" w:hint="default"/>
+      </w:rPr>
+    </w:lvl>
+    <w:lvl w:ilvl="4" w:tplc="04090003" w:tentative="1">
+      <w:start w:val="1"/>
+      <w:numFmt w:val="bullet"/>
+      <w:lvlText w:val="o"/>
+      <w:lvlJc w:val="left"/>
+      <w:pPr>
+        <w:ind w:left="3960" w:hanging="360"/>
+      </w:pPr>
+      <w:rPr>
+        <w:rFonts w:ascii="Courier New" w:hAnsi="Courier New" w:cs="Courier New" w:hint="default"/>
+      </w:rPr>
+    </w:lvl>
+    <w:lvl w:ilvl="5" w:tplc="04090005" w:tentative="1">
+      <w:start w:val="1"/>
+      <w:numFmt w:val="bullet"/>
+      <w:lvlText w:val=""/>
+      <w:lvlJc w:val="left"/>
+      <w:pPr>
+        <w:ind w:left="4680" w:hanging="360"/>
+      </w:pPr>
+      <w:rPr>
+        <w:rFonts w:ascii="Wingdings" w:hAnsi="Wingdings" w:hint="default"/>
+      </w:rPr>
+    </w:lvl>
+    <w:lvl w:ilvl="6" w:tplc="04090001" w:tentative="1">
+      <w:start w:val="1"/>
+      <w:numFmt w:val="bullet"/>
+      <w:lvlText w:val=""/>
+      <w:lvlJc w:val="left"/>
+      <w:pPr>
+        <w:ind w:left="5400" w:hanging="360"/>
+      </w:pPr>
+      <w:rPr>
+        <w:rFonts w:ascii="Symbol" w:hAnsi="Symbol" w:hint="default"/>
+      </w:rPr>
+    </w:lvl>
+    <w:lvl w:ilvl="7" w:tplc="04090003" w:tentative="1">
+      <w:start w:val="1"/>
+      <w:numFmt w:val="bullet"/>
+      <w:lvlText w:val="o"/>
+      <w:lvlJc w:val="left"/>
+      <w:pPr>
+        <w:ind w:left="6120" w:hanging="360"/>
+      </w:pPr>
+      <w:rPr>
+        <w:rFonts w:ascii="Courier New" w:hAnsi="Courier New" w:cs="Courier New" w:hint="default"/>
+      </w:rPr>
+    </w:lvl>
+    <w:lvl w:ilvl="8" w:tplc="04090005" w:tentative="1">
+      <w:start w:val="1"/>
+      <w:numFmt w:val="bullet"/>
+      <w:lvlText w:val=""/>
+      <w:lvlJc w:val="left"/>
+      <w:pPr>
+        <w:ind w:left="6840" w:hanging="360"/>
+      </w:pPr>
+      <w:rPr>
+        <w:rFonts w:ascii="Wingdings" w:hAnsi="Wingdings" w:hint="default"/>
+      </w:rPr>
+    </w:lvl>
+  </w:abstractNum>
+  <w:abstractNum w:abstractNumId="7" w15:restartNumberingAfterBreak="0">
     <w:nsid w:val="4D5D3D97"/>
     <w:multiLevelType w:val="hybridMultilevel"/>
     <w:tmpl w:val="52108F0E"/>
@@ -3142,7 +3206,7 @@
       </w:pPr>
     </w:lvl>
   </w:abstractNum>
-  <w:abstractNum w:abstractNumId="7" w15:restartNumberingAfterBreak="0">
+  <w:abstractNum w:abstractNumId="8" w15:restartNumberingAfterBreak="0">
     <w:nsid w:val="59100608"/>
     <w:multiLevelType w:val="hybridMultilevel"/>
     <w:tmpl w:val="F4305EC6"/>
@@ -3231,7 +3295,7 @@
       </w:pPr>
     </w:lvl>
   </w:abstractNum>
-  <w:abstractNum w:abstractNumId="8" w15:restartNumberingAfterBreak="0">
+  <w:abstractNum w:abstractNumId="9" w15:restartNumberingAfterBreak="0">
     <w:nsid w:val="74F40D4F"/>
     <w:multiLevelType w:val="hybridMultilevel"/>
     <w:tmpl w:val="60D2BE9A"/>
@@ -3320,7 +3384,7 @@
       </w:pPr>
     </w:lvl>
   </w:abstractNum>
-  <w:abstractNum w:abstractNumId="9" w15:restartNumberingAfterBreak="0">
+  <w:abstractNum w:abstractNumId="10" w15:restartNumberingAfterBreak="0">
     <w:nsid w:val="792837CF"/>
     <w:multiLevelType w:val="hybridMultilevel"/>
     <w:tmpl w:val="72DA6FC8"/>
@@ -3410,7 +3474,7 @@
     </w:lvl>
   </w:abstractNum>
   <w:num w:numId="1" w16cid:durableId="1913849408">
-    <w:abstractNumId w:val="7"/>
+    <w:abstractNumId w:val="8"/>
   </w:num>
   <w:num w:numId="2" w16cid:durableId="590506055">
     <w:abstractNumId w:val="2"/>
@@ -3419,10 +3483,10 @@
     <w:abstractNumId w:val="4"/>
   </w:num>
   <w:num w:numId="4" w16cid:durableId="344334215">
-    <w:abstractNumId w:val="6"/>
+    <w:abstractNumId w:val="7"/>
   </w:num>
   <w:num w:numId="5" w16cid:durableId="967055277">
-    <w:abstractNumId w:val="9"/>
+    <w:abstractNumId w:val="10"/>
   </w:num>
   <w:num w:numId="6" w16cid:durableId="1622300038">
     <w:abstractNumId w:val="5"/>
@@ -3437,7 +3501,10 @@
     <w:abstractNumId w:val="0"/>
   </w:num>
   <w:num w:numId="10" w16cid:durableId="655299545">
-    <w:abstractNumId w:val="8"/>
+    <w:abstractNumId w:val="9"/>
+  </w:num>
+  <w:num w:numId="11" w16cid:durableId="1990010514">
+    <w:abstractNumId w:val="6"/>
   </w:num>
 </w:numbering>
 </file>

</xml_diff>

<commit_message>
Updates to data dictionary
Added entries for processes 3-4 into the data dicftionary.
</commit_message>
<xml_diff>
--- a/TEAM_2_PRODUCTION_SYSTEM_DFD_1_DRAFT.docx
+++ b/TEAM_2_PRODUCTION_SYSTEM_DFD_1_DRAFT.docx
@@ -668,13 +668,6 @@
                 <w:rFonts w:ascii="Times New Roman" w:hAnsi="Times New Roman" w:cs="Times New Roman"/>
               </w:rPr>
             </w:pPr>
-          </w:p>
-          <w:p>
-            <w:pPr>
-              <w:rPr>
-                <w:rFonts w:ascii="Times New Roman" w:hAnsi="Times New Roman" w:cs="Times New Roman"/>
-              </w:rPr>
-            </w:pPr>
             <w:r>
               <w:rPr>
                 <w:rFonts w:ascii="Times New Roman" w:hAnsi="Times New Roman" w:cs="Times New Roman"/>
@@ -724,13 +717,6 @@
                 <w:rFonts w:ascii="Times New Roman" w:hAnsi="Times New Roman" w:cs="Times New Roman"/>
               </w:rPr>
             </w:pPr>
-          </w:p>
-          <w:p>
-            <w:pPr>
-              <w:rPr>
-                <w:rFonts w:ascii="Times New Roman" w:hAnsi="Times New Roman" w:cs="Times New Roman"/>
-              </w:rPr>
-            </w:pPr>
             <w:r>
               <w:rPr>
                 <w:rFonts w:ascii="Times New Roman" w:hAnsi="Times New Roman" w:cs="Times New Roman"/>
@@ -858,6 +844,62 @@
               <w:t>Process 1 must take place before manager entities may submit CRUD requests to the system.</w:t>
             </w:r>
           </w:p>
+          <w:p>
+            <w:pPr>
+              <w:rPr>
+                <w:rFonts w:ascii="Times New Roman" w:hAnsi="Times New Roman" w:cs="Times New Roman"/>
+              </w:rPr>
+            </w:pPr>
+            <w:r>
+              <w:rPr>
+                <w:rFonts w:ascii="Times New Roman" w:hAnsi="Times New Roman" w:cs="Times New Roman"/>
+              </w:rPr>
+              <w:t>Approved Roles:</w:t>
+            </w:r>
+          </w:p>
+          <w:p>
+            <w:pPr>
+              <w:pStyle w:val="ListParagraph"/>
+              <w:numPr>
+                <w:ilvl w:val="0"/>
+                <w:numId w:val="12"/>
+              </w:numPr>
+              <w:rPr>
+                <w:rFonts w:ascii="Times New Roman" w:hAnsi="Times New Roman" w:cs="Times New Roman"/>
+              </w:rPr>
+            </w:pPr>
+            <w:r>
+              <w:rPr>
+                <w:rFonts w:ascii="Times New Roman" w:hAnsi="Times New Roman" w:cs="Times New Roman"/>
+              </w:rPr>
+              <w:t>Fabrication &amp; Machine Shop: C/R/U/D Requests with soft-delete privileges.</w:t>
+            </w:r>
+          </w:p>
+          <w:p>
+            <w:pPr>
+              <w:pStyle w:val="ListParagraph"/>
+              <w:numPr>
+                <w:ilvl w:val="0"/>
+                <w:numId w:val="12"/>
+              </w:numPr>
+              <w:rPr>
+                <w:rFonts w:ascii="Times New Roman" w:hAnsi="Times New Roman" w:cs="Times New Roman"/>
+              </w:rPr>
+            </w:pPr>
+            <w:r>
+              <w:rPr>
+                <w:rFonts w:ascii="Times New Roman" w:hAnsi="Times New Roman" w:cs="Times New Roman"/>
+              </w:rPr>
+              <w:t>Quality &amp; Shipping: Ready Only privileges.</w:t>
+            </w:r>
+          </w:p>
+          <w:p>
+            <w:pPr>
+              <w:rPr>
+                <w:rFonts w:ascii="Times New Roman" w:hAnsi="Times New Roman" w:cs="Times New Roman"/>
+              </w:rPr>
+            </w:pPr>
+          </w:p>
         </w:tc>
       </w:tr>
     </w:tbl>
@@ -1018,40 +1060,6 @@
     <w:p>
       <w:pPr>
         <w:spacing w:after="0" w:line="240" w:lineRule="auto"/>
-        <w:jc w:val="center"/>
-        <w:rPr>
-          <w:rFonts w:ascii="Times New Roman" w:hAnsi="Times New Roman" w:cs="Times New Roman"/>
-          <w:b/>
-          <w:bCs/>
-        </w:rPr>
-      </w:pPr>
-    </w:p>
-    <w:p>
-      <w:pPr>
-        <w:spacing w:after="0" w:line="240" w:lineRule="auto"/>
-        <w:jc w:val="center"/>
-        <w:rPr>
-          <w:rFonts w:ascii="Times New Roman" w:hAnsi="Times New Roman" w:cs="Times New Roman"/>
-          <w:b/>
-          <w:bCs/>
-        </w:rPr>
-      </w:pPr>
-    </w:p>
-    <w:p>
-      <w:pPr>
-        <w:spacing w:after="0" w:line="240" w:lineRule="auto"/>
-        <w:jc w:val="center"/>
-        <w:rPr>
-          <w:rFonts w:ascii="Times New Roman" w:hAnsi="Times New Roman" w:cs="Times New Roman"/>
-          <w:b/>
-          <w:bCs/>
-        </w:rPr>
-      </w:pPr>
-    </w:p>
-    <w:p>
-      <w:pPr>
-        <w:spacing w:after="0" w:line="240" w:lineRule="auto"/>
-        <w:jc w:val="center"/>
         <w:rPr>
           <w:rFonts w:ascii="Times New Roman" w:hAnsi="Times New Roman" w:cs="Times New Roman"/>
           <w:b/>
@@ -1591,13 +1599,6 @@
                 <w:rFonts w:ascii="Times New Roman" w:hAnsi="Times New Roman" w:cs="Times New Roman"/>
               </w:rPr>
             </w:pPr>
-          </w:p>
-          <w:p>
-            <w:pPr>
-              <w:rPr>
-                <w:rFonts w:ascii="Times New Roman" w:hAnsi="Times New Roman" w:cs="Times New Roman"/>
-              </w:rPr>
-            </w:pPr>
             <w:r>
               <w:rPr>
                 <w:rFonts w:ascii="Times New Roman" w:hAnsi="Times New Roman" w:cs="Times New Roman"/>
@@ -1847,59 +1848,58 @@
               <w:t>process 2.</w:t>
             </w:r>
           </w:p>
+          <w:p>
+            <w:pPr>
+              <w:rPr>
+                <w:rFonts w:ascii="Times New Roman" w:hAnsi="Times New Roman" w:cs="Times New Roman"/>
+              </w:rPr>
+            </w:pPr>
+            <w:r>
+              <w:rPr>
+                <w:rFonts w:ascii="Times New Roman" w:hAnsi="Times New Roman" w:cs="Times New Roman"/>
+              </w:rPr>
+              <w:t>Approved Roles:</w:t>
+            </w:r>
+          </w:p>
+          <w:p>
+            <w:pPr>
+              <w:pStyle w:val="ListParagraph"/>
+              <w:numPr>
+                <w:ilvl w:val="0"/>
+                <w:numId w:val="11"/>
+              </w:numPr>
+              <w:rPr>
+                <w:rFonts w:ascii="Times New Roman" w:hAnsi="Times New Roman" w:cs="Times New Roman"/>
+              </w:rPr>
+            </w:pPr>
+            <w:r>
+              <w:rPr>
+                <w:rFonts w:ascii="Times New Roman" w:hAnsi="Times New Roman" w:cs="Times New Roman"/>
+              </w:rPr>
+              <w:t>Fabrication &amp; Machine Shop.</w:t>
+            </w:r>
+          </w:p>
+          <w:p>
+            <w:pPr>
+              <w:pStyle w:val="ListParagraph"/>
+              <w:numPr>
+                <w:ilvl w:val="0"/>
+                <w:numId w:val="11"/>
+              </w:numPr>
+              <w:rPr>
+                <w:rFonts w:ascii="Times New Roman" w:hAnsi="Times New Roman" w:cs="Times New Roman"/>
+              </w:rPr>
+            </w:pPr>
+            <w:r>
+              <w:rPr>
+                <w:rFonts w:ascii="Times New Roman" w:hAnsi="Times New Roman" w:cs="Times New Roman"/>
+              </w:rPr>
+              <w:t>Quality &amp; Shipping.</w:t>
+            </w:r>
+          </w:p>
         </w:tc>
       </w:tr>
     </w:tbl>
-    <w:p>
-      <w:pPr>
-        <w:spacing w:after="0" w:line="240" w:lineRule="auto"/>
-        <w:rPr>
-          <w:rFonts w:ascii="Times New Roman" w:hAnsi="Times New Roman" w:cs="Times New Roman"/>
-          <w:b/>
-          <w:bCs/>
-        </w:rPr>
-      </w:pPr>
-    </w:p>
-    <w:p>
-      <w:pPr>
-        <w:spacing w:after="0" w:line="240" w:lineRule="auto"/>
-        <w:rPr>
-          <w:rFonts w:ascii="Times New Roman" w:hAnsi="Times New Roman" w:cs="Times New Roman"/>
-          <w:b/>
-          <w:bCs/>
-        </w:rPr>
-      </w:pPr>
-    </w:p>
-    <w:p>
-      <w:pPr>
-        <w:spacing w:after="0" w:line="240" w:lineRule="auto"/>
-        <w:rPr>
-          <w:rFonts w:ascii="Times New Roman" w:hAnsi="Times New Roman" w:cs="Times New Roman"/>
-          <w:b/>
-          <w:bCs/>
-        </w:rPr>
-      </w:pPr>
-    </w:p>
-    <w:p>
-      <w:pPr>
-        <w:spacing w:after="0" w:line="240" w:lineRule="auto"/>
-        <w:rPr>
-          <w:rFonts w:ascii="Times New Roman" w:hAnsi="Times New Roman" w:cs="Times New Roman"/>
-          <w:b/>
-          <w:bCs/>
-        </w:rPr>
-      </w:pPr>
-    </w:p>
-    <w:p>
-      <w:pPr>
-        <w:spacing w:after="0" w:line="240" w:lineRule="auto"/>
-        <w:rPr>
-          <w:rFonts w:ascii="Times New Roman" w:hAnsi="Times New Roman" w:cs="Times New Roman"/>
-          <w:b/>
-          <w:bCs/>
-        </w:rPr>
-      </w:pPr>
-    </w:p>
     <w:p>
       <w:pPr>
         <w:spacing w:after="0" w:line="240" w:lineRule="auto"/>
@@ -2249,13 +2249,6 @@
                 <w:rFonts w:ascii="Times New Roman" w:hAnsi="Times New Roman" w:cs="Times New Roman"/>
               </w:rPr>
             </w:pPr>
-          </w:p>
-          <w:p>
-            <w:pPr>
-              <w:rPr>
-                <w:rFonts w:ascii="Times New Roman" w:hAnsi="Times New Roman" w:cs="Times New Roman"/>
-              </w:rPr>
-            </w:pPr>
             <w:r>
               <w:rPr>
                 <w:rFonts w:ascii="Times New Roman" w:hAnsi="Times New Roman" w:cs="Times New Roman"/>
@@ -2370,19 +2363,7 @@
               <w:rPr>
                 <w:rFonts w:ascii="Times New Roman" w:hAnsi="Times New Roman" w:cs="Times New Roman"/>
               </w:rPr>
-              <w:t xml:space="preserve">SEND the INPUT VALIDATION ERROR MESSAGE to the DEPARTMENT USER INTERFACES entity when </w:t>
-            </w:r>
-            <w:r>
-              <w:rPr>
-                <w:rFonts w:ascii="Times New Roman" w:hAnsi="Times New Roman" w:cs="Times New Roman"/>
-              </w:rPr>
-              <w:t>WO C/U/D REQUEST required field</w:t>
-            </w:r>
-            <w:r>
-              <w:rPr>
-                <w:rFonts w:ascii="Times New Roman" w:hAnsi="Times New Roman" w:cs="Times New Roman"/>
-              </w:rPr>
-              <w:t xml:space="preserve"> input fails validation constraints.</w:t>
+              <w:t>SEND the INPUT VALIDATION ERROR MESSAGE to the DEPARTMENT USER INTERFACES entity when WO C/U/D REQUEST required field input fails validation constraints.</w:t>
             </w:r>
           </w:p>
         </w:tc>
@@ -2443,6 +2424,1484 @@
                 <w:rFonts w:ascii="Times New Roman" w:hAnsi="Times New Roman" w:cs="Times New Roman"/>
               </w:rPr>
               <w:t>.</w:t>
+            </w:r>
+          </w:p>
+          <w:p>
+            <w:pPr>
+              <w:rPr>
+                <w:rFonts w:ascii="Times New Roman" w:hAnsi="Times New Roman" w:cs="Times New Roman"/>
+              </w:rPr>
+            </w:pPr>
+            <w:r>
+              <w:rPr>
+                <w:rFonts w:ascii="Times New Roman" w:hAnsi="Times New Roman" w:cs="Times New Roman"/>
+              </w:rPr>
+              <w:t>Approved Roles:</w:t>
+            </w:r>
+          </w:p>
+          <w:p>
+            <w:pPr>
+              <w:pStyle w:val="ListParagraph"/>
+              <w:numPr>
+                <w:ilvl w:val="0"/>
+                <w:numId w:val="11"/>
+              </w:numPr>
+              <w:rPr>
+                <w:rFonts w:ascii="Times New Roman" w:hAnsi="Times New Roman" w:cs="Times New Roman"/>
+              </w:rPr>
+            </w:pPr>
+            <w:r>
+              <w:rPr>
+                <w:rFonts w:ascii="Times New Roman" w:hAnsi="Times New Roman" w:cs="Times New Roman"/>
+              </w:rPr>
+              <w:t>Fabrication &amp; Machine Shop: Full C/R/U/D with soft-delete access privileges.</w:t>
+            </w:r>
+          </w:p>
+        </w:tc>
+      </w:tr>
+    </w:tbl>
+    <w:p>
+      <w:pPr>
+        <w:spacing w:after="0" w:line="240" w:lineRule="auto"/>
+        <w:jc w:val="center"/>
+        <w:rPr>
+          <w:rFonts w:ascii="Times New Roman" w:hAnsi="Times New Roman" w:cs="Times New Roman"/>
+          <w:b/>
+          <w:bCs/>
+        </w:rPr>
+      </w:pPr>
+    </w:p>
+    <w:p>
+      <w:pPr>
+        <w:spacing w:after="0" w:line="240" w:lineRule="auto"/>
+        <w:jc w:val="center"/>
+        <w:rPr>
+          <w:rFonts w:ascii="Times New Roman" w:hAnsi="Times New Roman" w:cs="Times New Roman"/>
+          <w:b/>
+          <w:bCs/>
+        </w:rPr>
+      </w:pPr>
+    </w:p>
+    <w:p>
+      <w:pPr>
+        <w:spacing w:after="0" w:line="240" w:lineRule="auto"/>
+        <w:jc w:val="center"/>
+        <w:rPr>
+          <w:rFonts w:ascii="Times New Roman" w:hAnsi="Times New Roman" w:cs="Times New Roman"/>
+          <w:b/>
+          <w:bCs/>
+        </w:rPr>
+      </w:pPr>
+    </w:p>
+    <w:p>
+      <w:pPr>
+        <w:spacing w:after="0" w:line="240" w:lineRule="auto"/>
+        <w:jc w:val="center"/>
+        <w:rPr>
+          <w:rFonts w:ascii="Times New Roman" w:hAnsi="Times New Roman" w:cs="Times New Roman"/>
+          <w:b/>
+          <w:bCs/>
+        </w:rPr>
+      </w:pPr>
+    </w:p>
+    <w:p>
+      <w:pPr>
+        <w:spacing w:after="0" w:line="240" w:lineRule="auto"/>
+        <w:jc w:val="center"/>
+        <w:rPr>
+          <w:rFonts w:ascii="Times New Roman" w:hAnsi="Times New Roman" w:cs="Times New Roman"/>
+          <w:b/>
+          <w:bCs/>
+        </w:rPr>
+      </w:pPr>
+    </w:p>
+    <w:p>
+      <w:pPr>
+        <w:spacing w:after="0" w:line="240" w:lineRule="auto"/>
+        <w:jc w:val="center"/>
+        <w:rPr>
+          <w:rFonts w:ascii="Times New Roman" w:hAnsi="Times New Roman" w:cs="Times New Roman"/>
+          <w:b/>
+          <w:bCs/>
+        </w:rPr>
+      </w:pPr>
+    </w:p>
+    <w:p>
+      <w:pPr>
+        <w:spacing w:after="0" w:line="240" w:lineRule="auto"/>
+        <w:jc w:val="center"/>
+        <w:rPr>
+          <w:rFonts w:ascii="Times New Roman" w:hAnsi="Times New Roman" w:cs="Times New Roman"/>
+          <w:b/>
+          <w:bCs/>
+        </w:rPr>
+      </w:pPr>
+    </w:p>
+    <w:p>
+      <w:pPr>
+        <w:spacing w:after="0" w:line="240" w:lineRule="auto"/>
+        <w:jc w:val="center"/>
+        <w:rPr>
+          <w:rFonts w:ascii="Times New Roman" w:hAnsi="Times New Roman" w:cs="Times New Roman"/>
+          <w:b/>
+          <w:bCs/>
+        </w:rPr>
+      </w:pPr>
+    </w:p>
+    <w:p>
+      <w:pPr>
+        <w:spacing w:after="0" w:line="240" w:lineRule="auto"/>
+        <w:jc w:val="center"/>
+        <w:rPr>
+          <w:rFonts w:ascii="Times New Roman" w:hAnsi="Times New Roman" w:cs="Times New Roman"/>
+          <w:b/>
+          <w:bCs/>
+        </w:rPr>
+      </w:pPr>
+    </w:p>
+    <w:p>
+      <w:pPr>
+        <w:spacing w:after="0" w:line="240" w:lineRule="auto"/>
+        <w:jc w:val="center"/>
+        <w:rPr>
+          <w:rFonts w:ascii="Times New Roman" w:hAnsi="Times New Roman" w:cs="Times New Roman"/>
+          <w:b/>
+          <w:bCs/>
+        </w:rPr>
+      </w:pPr>
+    </w:p>
+    <w:p>
+      <w:pPr>
+        <w:spacing w:after="0" w:line="240" w:lineRule="auto"/>
+        <w:jc w:val="center"/>
+        <w:rPr>
+          <w:rFonts w:ascii="Times New Roman" w:hAnsi="Times New Roman" w:cs="Times New Roman"/>
+          <w:b/>
+          <w:bCs/>
+        </w:rPr>
+      </w:pPr>
+    </w:p>
+    <w:p>
+      <w:pPr>
+        <w:spacing w:after="0" w:line="240" w:lineRule="auto"/>
+        <w:jc w:val="center"/>
+        <w:rPr>
+          <w:rFonts w:ascii="Times New Roman" w:hAnsi="Times New Roman" w:cs="Times New Roman"/>
+          <w:b/>
+          <w:bCs/>
+        </w:rPr>
+      </w:pPr>
+    </w:p>
+    <w:p>
+      <w:pPr>
+        <w:spacing w:after="0" w:line="240" w:lineRule="auto"/>
+        <w:jc w:val="center"/>
+        <w:rPr>
+          <w:rFonts w:ascii="Times New Roman" w:hAnsi="Times New Roman" w:cs="Times New Roman"/>
+          <w:b/>
+          <w:bCs/>
+        </w:rPr>
+      </w:pPr>
+    </w:p>
+    <w:p>
+      <w:pPr>
+        <w:spacing w:after="0" w:line="240" w:lineRule="auto"/>
+        <w:jc w:val="center"/>
+        <w:rPr>
+          <w:rFonts w:ascii="Times New Roman" w:hAnsi="Times New Roman" w:cs="Times New Roman"/>
+          <w:b/>
+          <w:bCs/>
+        </w:rPr>
+      </w:pPr>
+    </w:p>
+    <w:tbl>
+      <w:tblPr>
+        <w:tblStyle w:val="TableGrid"/>
+        <w:tblW w:w="0" w:type="auto"/>
+        <w:tblLook w:val="04A0" w:firstRow="1" w:lastRow="0" w:firstColumn="1" w:lastColumn="0" w:noHBand="0" w:noVBand="1"/>
+      </w:tblPr>
+      <w:tblGrid>
+        <w:gridCol w:w="2335"/>
+        <w:gridCol w:w="7015"/>
+      </w:tblGrid>
+      <w:tr>
+        <w:tc>
+          <w:tcPr>
+            <w:tcW w:w="2335" w:type="dxa"/>
+          </w:tcPr>
+          <w:p>
+            <w:pPr>
+              <w:rPr>
+                <w:rFonts w:ascii="Times New Roman" w:hAnsi="Times New Roman" w:cs="Times New Roman"/>
+                <w:b/>
+                <w:bCs/>
+              </w:rPr>
+            </w:pPr>
+            <w:r>
+              <w:rPr>
+                <w:rFonts w:ascii="Times New Roman" w:hAnsi="Times New Roman" w:cs="Times New Roman"/>
+                <w:b/>
+                <w:bCs/>
+              </w:rPr>
+              <w:lastRenderedPageBreak/>
+              <w:t>Label:</w:t>
+            </w:r>
+          </w:p>
+        </w:tc>
+        <w:tc>
+          <w:tcPr>
+            <w:tcW w:w="7015" w:type="dxa"/>
+          </w:tcPr>
+          <w:p>
+            <w:pPr>
+              <w:rPr>
+                <w:rFonts w:ascii="Times New Roman" w:hAnsi="Times New Roman" w:cs="Times New Roman"/>
+              </w:rPr>
+            </w:pPr>
+            <w:r>
+              <w:rPr>
+                <w:rFonts w:ascii="Times New Roman" w:hAnsi="Times New Roman" w:cs="Times New Roman"/>
+              </w:rPr>
+              <w:t>AUDIT LOGGING</w:t>
+            </w:r>
+          </w:p>
+        </w:tc>
+      </w:tr>
+      <w:tr>
+        <w:tc>
+          <w:tcPr>
+            <w:tcW w:w="2335" w:type="dxa"/>
+          </w:tcPr>
+          <w:p>
+            <w:pPr>
+              <w:rPr>
+                <w:rFonts w:ascii="Times New Roman" w:hAnsi="Times New Roman" w:cs="Times New Roman"/>
+                <w:b/>
+                <w:bCs/>
+              </w:rPr>
+            </w:pPr>
+            <w:r>
+              <w:rPr>
+                <w:rFonts w:ascii="Times New Roman" w:hAnsi="Times New Roman" w:cs="Times New Roman"/>
+                <w:b/>
+                <w:bCs/>
+              </w:rPr>
+              <w:t>Entry Type:</w:t>
+            </w:r>
+          </w:p>
+        </w:tc>
+        <w:tc>
+          <w:tcPr>
+            <w:tcW w:w="7015" w:type="dxa"/>
+          </w:tcPr>
+          <w:p>
+            <w:pPr>
+              <w:rPr>
+                <w:rFonts w:ascii="Times New Roman" w:hAnsi="Times New Roman" w:cs="Times New Roman"/>
+              </w:rPr>
+            </w:pPr>
+            <w:r>
+              <w:rPr>
+                <w:rFonts w:ascii="Times New Roman" w:hAnsi="Times New Roman" w:cs="Times New Roman"/>
+              </w:rPr>
+              <w:t>Process</w:t>
+            </w:r>
+          </w:p>
+        </w:tc>
+      </w:tr>
+      <w:tr>
+        <w:tc>
+          <w:tcPr>
+            <w:tcW w:w="2335" w:type="dxa"/>
+          </w:tcPr>
+          <w:p>
+            <w:pPr>
+              <w:rPr>
+                <w:rFonts w:ascii="Times New Roman" w:hAnsi="Times New Roman" w:cs="Times New Roman"/>
+                <w:b/>
+                <w:bCs/>
+              </w:rPr>
+            </w:pPr>
+            <w:r>
+              <w:rPr>
+                <w:rFonts w:ascii="Times New Roman" w:hAnsi="Times New Roman" w:cs="Times New Roman"/>
+                <w:b/>
+                <w:bCs/>
+              </w:rPr>
+              <w:t>Description:</w:t>
+            </w:r>
+          </w:p>
+        </w:tc>
+        <w:tc>
+          <w:tcPr>
+            <w:tcW w:w="7015" w:type="dxa"/>
+          </w:tcPr>
+          <w:p>
+            <w:pPr>
+              <w:rPr>
+                <w:rFonts w:ascii="Times New Roman" w:hAnsi="Times New Roman" w:cs="Times New Roman"/>
+              </w:rPr>
+            </w:pPr>
+            <w:r>
+              <w:rPr>
+                <w:rFonts w:ascii="Times New Roman" w:hAnsi="Times New Roman" w:cs="Times New Roman"/>
+              </w:rPr>
+              <w:t>Record Create, Update, and Delete (soft) transactions from Fabrication &amp; Machine Shop departments. Update the audit log file stored in directory on server that hosts database.</w:t>
+            </w:r>
+          </w:p>
+        </w:tc>
+      </w:tr>
+      <w:tr>
+        <w:tc>
+          <w:tcPr>
+            <w:tcW w:w="2335" w:type="dxa"/>
+          </w:tcPr>
+          <w:p>
+            <w:pPr>
+              <w:rPr>
+                <w:rFonts w:ascii="Times New Roman" w:hAnsi="Times New Roman" w:cs="Times New Roman"/>
+                <w:b/>
+                <w:bCs/>
+              </w:rPr>
+            </w:pPr>
+            <w:r>
+              <w:rPr>
+                <w:rFonts w:ascii="Times New Roman" w:hAnsi="Times New Roman" w:cs="Times New Roman"/>
+                <w:b/>
+                <w:bCs/>
+              </w:rPr>
+              <w:t>Process #:</w:t>
+            </w:r>
+          </w:p>
+        </w:tc>
+        <w:tc>
+          <w:tcPr>
+            <w:tcW w:w="7015" w:type="dxa"/>
+          </w:tcPr>
+          <w:p>
+            <w:pPr>
+              <w:rPr>
+                <w:rFonts w:ascii="Times New Roman" w:hAnsi="Times New Roman" w:cs="Times New Roman"/>
+              </w:rPr>
+            </w:pPr>
+            <w:r>
+              <w:rPr>
+                <w:rFonts w:ascii="Times New Roman" w:hAnsi="Times New Roman" w:cs="Times New Roman"/>
+              </w:rPr>
+              <w:t>4</w:t>
+            </w:r>
+          </w:p>
+        </w:tc>
+      </w:tr>
+      <w:tr>
+        <w:tc>
+          <w:tcPr>
+            <w:tcW w:w="2335" w:type="dxa"/>
+          </w:tcPr>
+          <w:p>
+            <w:pPr>
+              <w:rPr>
+                <w:rFonts w:ascii="Times New Roman" w:hAnsi="Times New Roman" w:cs="Times New Roman"/>
+                <w:b/>
+                <w:bCs/>
+              </w:rPr>
+            </w:pPr>
+            <w:r>
+              <w:rPr>
+                <w:rFonts w:ascii="Times New Roman" w:hAnsi="Times New Roman" w:cs="Times New Roman"/>
+                <w:b/>
+                <w:bCs/>
+              </w:rPr>
+              <w:t>Process Description:</w:t>
+            </w:r>
+          </w:p>
+        </w:tc>
+        <w:tc>
+          <w:tcPr>
+            <w:tcW w:w="7015" w:type="dxa"/>
+          </w:tcPr>
+          <w:p>
+            <w:pPr>
+              <w:rPr>
+                <w:rFonts w:ascii="Times New Roman" w:hAnsi="Times New Roman" w:cs="Times New Roman"/>
+              </w:rPr>
+            </w:pPr>
+            <w:r>
+              <w:rPr>
+                <w:rFonts w:ascii="Times New Roman" w:hAnsi="Times New Roman" w:cs="Times New Roman"/>
+              </w:rPr>
+              <w:t>Input Data Flows:</w:t>
+            </w:r>
+          </w:p>
+          <w:p>
+            <w:pPr>
+              <w:pStyle w:val="ListParagraph"/>
+              <w:numPr>
+                <w:ilvl w:val="0"/>
+                <w:numId w:val="13"/>
+              </w:numPr>
+              <w:rPr>
+                <w:rFonts w:ascii="Times New Roman" w:hAnsi="Times New Roman" w:cs="Times New Roman"/>
+              </w:rPr>
+            </w:pPr>
+            <w:r>
+              <w:rPr>
+                <w:rFonts w:ascii="Times New Roman" w:hAnsi="Times New Roman" w:cs="Times New Roman"/>
+              </w:rPr>
+              <w:t>RECORDED C/U/D TRANSACTIONS</w:t>
+            </w:r>
+          </w:p>
+          <w:p>
+            <w:pPr>
+              <w:rPr>
+                <w:rFonts w:ascii="Times New Roman" w:hAnsi="Times New Roman" w:cs="Times New Roman"/>
+              </w:rPr>
+            </w:pPr>
+            <w:r>
+              <w:rPr>
+                <w:rFonts w:ascii="Times New Roman" w:hAnsi="Times New Roman" w:cs="Times New Roman"/>
+              </w:rPr>
+              <w:t>Output Data Flows:</w:t>
+            </w:r>
+          </w:p>
+          <w:p>
+            <w:pPr>
+              <w:pStyle w:val="ListParagraph"/>
+              <w:numPr>
+                <w:ilvl w:val="0"/>
+                <w:numId w:val="14"/>
+              </w:numPr>
+              <w:rPr>
+                <w:rFonts w:ascii="Times New Roman" w:hAnsi="Times New Roman" w:cs="Times New Roman"/>
+              </w:rPr>
+            </w:pPr>
+            <w:r>
+              <w:rPr>
+                <w:rFonts w:ascii="Times New Roman" w:hAnsi="Times New Roman" w:cs="Times New Roman"/>
+              </w:rPr>
+              <w:t>AUDIT LOG UPDATES</w:t>
+            </w:r>
+          </w:p>
+          <w:p>
+            <w:pPr>
+              <w:rPr>
+                <w:rFonts w:ascii="Times New Roman" w:hAnsi="Times New Roman" w:cs="Times New Roman"/>
+              </w:rPr>
+            </w:pPr>
+            <w:r>
+              <w:rPr>
+                <w:rFonts w:ascii="Times New Roman" w:hAnsi="Times New Roman" w:cs="Times New Roman"/>
+              </w:rPr>
+              <w:t xml:space="preserve">RECEIVE the </w:t>
+            </w:r>
+            <w:r>
+              <w:rPr>
+                <w:rFonts w:ascii="Times New Roman" w:hAnsi="Times New Roman" w:cs="Times New Roman"/>
+              </w:rPr>
+              <w:t>C/U/D TRANSACTIONS from the PRODUCTION DATA DATABASE.</w:t>
+            </w:r>
+          </w:p>
+          <w:p>
+            <w:pPr>
+              <w:rPr>
+                <w:rFonts w:ascii="Times New Roman" w:hAnsi="Times New Roman" w:cs="Times New Roman"/>
+              </w:rPr>
+            </w:pPr>
+          </w:p>
+          <w:p>
+            <w:pPr>
+              <w:rPr>
+                <w:rFonts w:ascii="Times New Roman" w:hAnsi="Times New Roman" w:cs="Times New Roman"/>
+              </w:rPr>
+            </w:pPr>
+            <w:r>
+              <w:rPr>
+                <w:rFonts w:ascii="Times New Roman" w:hAnsi="Times New Roman" w:cs="Times New Roman"/>
+              </w:rPr>
+              <w:t>SEND the AUDIT LOG UPDATES to the AUDIT LOG.</w:t>
+            </w:r>
+          </w:p>
+        </w:tc>
+      </w:tr>
+      <w:tr>
+        <w:tc>
+          <w:tcPr>
+            <w:tcW w:w="2335" w:type="dxa"/>
+          </w:tcPr>
+          <w:p>
+            <w:pPr>
+              <w:rPr>
+                <w:rFonts w:ascii="Times New Roman" w:hAnsi="Times New Roman" w:cs="Times New Roman"/>
+                <w:b/>
+                <w:bCs/>
+              </w:rPr>
+            </w:pPr>
+            <w:r>
+              <w:rPr>
+                <w:rFonts w:ascii="Times New Roman" w:hAnsi="Times New Roman" w:cs="Times New Roman"/>
+                <w:b/>
+                <w:bCs/>
+              </w:rPr>
+              <w:t>Notes:</w:t>
+            </w:r>
+          </w:p>
+        </w:tc>
+        <w:tc>
+          <w:tcPr>
+            <w:tcW w:w="7015" w:type="dxa"/>
+          </w:tcPr>
+          <w:p>
+            <w:pPr>
+              <w:rPr>
+                <w:rFonts w:ascii="Times New Roman" w:hAnsi="Times New Roman" w:cs="Times New Roman"/>
+              </w:rPr>
+            </w:pPr>
+            <w:r>
+              <w:rPr>
+                <w:rFonts w:ascii="Times New Roman" w:hAnsi="Times New Roman" w:cs="Times New Roman"/>
+              </w:rPr>
+              <w:t>C/U/D transactions are recorded daily and are sent to the AUDIT LOG at the time they are recorded.</w:t>
+            </w:r>
+          </w:p>
+        </w:tc>
+      </w:tr>
+    </w:tbl>
+    <w:p>
+      <w:pPr>
+        <w:spacing w:after="0" w:line="240" w:lineRule="auto"/>
+        <w:jc w:val="center"/>
+        <w:rPr>
+          <w:rFonts w:ascii="Times New Roman" w:hAnsi="Times New Roman" w:cs="Times New Roman"/>
+          <w:b/>
+          <w:bCs/>
+        </w:rPr>
+      </w:pPr>
+    </w:p>
+    <w:p>
+      <w:pPr>
+        <w:spacing w:after="0" w:line="240" w:lineRule="auto"/>
+        <w:jc w:val="center"/>
+        <w:rPr>
+          <w:rFonts w:ascii="Times New Roman" w:hAnsi="Times New Roman" w:cs="Times New Roman"/>
+          <w:b/>
+          <w:bCs/>
+        </w:rPr>
+      </w:pPr>
+    </w:p>
+    <w:p>
+      <w:pPr>
+        <w:spacing w:after="0" w:line="240" w:lineRule="auto"/>
+        <w:jc w:val="center"/>
+        <w:rPr>
+          <w:rFonts w:ascii="Times New Roman" w:hAnsi="Times New Roman" w:cs="Times New Roman"/>
+          <w:b/>
+          <w:bCs/>
+        </w:rPr>
+      </w:pPr>
+    </w:p>
+    <w:tbl>
+      <w:tblPr>
+        <w:tblStyle w:val="TableGrid"/>
+        <w:tblW w:w="0" w:type="auto"/>
+        <w:tblLook w:val="04A0" w:firstRow="1" w:lastRow="0" w:firstColumn="1" w:lastColumn="0" w:noHBand="0" w:noVBand="1"/>
+      </w:tblPr>
+      <w:tblGrid>
+        <w:gridCol w:w="2335"/>
+        <w:gridCol w:w="7015"/>
+      </w:tblGrid>
+      <w:tr>
+        <w:tc>
+          <w:tcPr>
+            <w:tcW w:w="2335" w:type="dxa"/>
+          </w:tcPr>
+          <w:p>
+            <w:pPr>
+              <w:rPr>
+                <w:rFonts w:ascii="Times New Roman" w:hAnsi="Times New Roman" w:cs="Times New Roman"/>
+                <w:b/>
+                <w:bCs/>
+              </w:rPr>
+            </w:pPr>
+            <w:r>
+              <w:rPr>
+                <w:rFonts w:ascii="Times New Roman" w:hAnsi="Times New Roman" w:cs="Times New Roman"/>
+                <w:b/>
+                <w:bCs/>
+              </w:rPr>
+              <w:t>Label:</w:t>
+            </w:r>
+          </w:p>
+        </w:tc>
+        <w:tc>
+          <w:tcPr>
+            <w:tcW w:w="7015" w:type="dxa"/>
+          </w:tcPr>
+          <w:p>
+            <w:pPr>
+              <w:rPr>
+                <w:rFonts w:ascii="Times New Roman" w:hAnsi="Times New Roman" w:cs="Times New Roman"/>
+              </w:rPr>
+            </w:pPr>
+            <w:r>
+              <w:rPr>
+                <w:rFonts w:ascii="Times New Roman" w:hAnsi="Times New Roman" w:cs="Times New Roman"/>
+              </w:rPr>
+              <w:t>DATA MIGRATION UTILITY</w:t>
+            </w:r>
+          </w:p>
+        </w:tc>
+      </w:tr>
+      <w:tr>
+        <w:tc>
+          <w:tcPr>
+            <w:tcW w:w="2335" w:type="dxa"/>
+          </w:tcPr>
+          <w:p>
+            <w:pPr>
+              <w:rPr>
+                <w:rFonts w:ascii="Times New Roman" w:hAnsi="Times New Roman" w:cs="Times New Roman"/>
+                <w:b/>
+                <w:bCs/>
+              </w:rPr>
+            </w:pPr>
+            <w:r>
+              <w:rPr>
+                <w:rFonts w:ascii="Times New Roman" w:hAnsi="Times New Roman" w:cs="Times New Roman"/>
+                <w:b/>
+                <w:bCs/>
+              </w:rPr>
+              <w:t>Entry Type:</w:t>
+            </w:r>
+          </w:p>
+        </w:tc>
+        <w:tc>
+          <w:tcPr>
+            <w:tcW w:w="7015" w:type="dxa"/>
+          </w:tcPr>
+          <w:p>
+            <w:pPr>
+              <w:rPr>
+                <w:rFonts w:ascii="Times New Roman" w:hAnsi="Times New Roman" w:cs="Times New Roman"/>
+              </w:rPr>
+            </w:pPr>
+            <w:r>
+              <w:rPr>
+                <w:rFonts w:ascii="Times New Roman" w:hAnsi="Times New Roman" w:cs="Times New Roman"/>
+              </w:rPr>
+              <w:t>Process</w:t>
+            </w:r>
+          </w:p>
+        </w:tc>
+      </w:tr>
+      <w:tr>
+        <w:tc>
+          <w:tcPr>
+            <w:tcW w:w="2335" w:type="dxa"/>
+          </w:tcPr>
+          <w:p>
+            <w:pPr>
+              <w:rPr>
+                <w:rFonts w:ascii="Times New Roman" w:hAnsi="Times New Roman" w:cs="Times New Roman"/>
+                <w:b/>
+                <w:bCs/>
+              </w:rPr>
+            </w:pPr>
+            <w:r>
+              <w:rPr>
+                <w:rFonts w:ascii="Times New Roman" w:hAnsi="Times New Roman" w:cs="Times New Roman"/>
+                <w:b/>
+                <w:bCs/>
+              </w:rPr>
+              <w:t>Description:</w:t>
+            </w:r>
+          </w:p>
+        </w:tc>
+        <w:tc>
+          <w:tcPr>
+            <w:tcW w:w="7015" w:type="dxa"/>
+          </w:tcPr>
+          <w:p>
+            <w:pPr>
+              <w:rPr>
+                <w:rFonts w:ascii="Times New Roman" w:hAnsi="Times New Roman" w:cs="Times New Roman"/>
+              </w:rPr>
+            </w:pPr>
+            <w:r>
+              <w:rPr>
+                <w:rFonts w:ascii="Times New Roman" w:hAnsi="Times New Roman" w:cs="Times New Roman"/>
+              </w:rPr>
+              <w:t>Import Legacy Data from previous Microsoft Access Database in a .CSV file format.</w:t>
+            </w:r>
+          </w:p>
+        </w:tc>
+      </w:tr>
+      <w:tr>
+        <w:tc>
+          <w:tcPr>
+            <w:tcW w:w="2335" w:type="dxa"/>
+          </w:tcPr>
+          <w:p>
+            <w:pPr>
+              <w:rPr>
+                <w:rFonts w:ascii="Times New Roman" w:hAnsi="Times New Roman" w:cs="Times New Roman"/>
+                <w:b/>
+                <w:bCs/>
+              </w:rPr>
+            </w:pPr>
+            <w:r>
+              <w:rPr>
+                <w:rFonts w:ascii="Times New Roman" w:hAnsi="Times New Roman" w:cs="Times New Roman"/>
+                <w:b/>
+                <w:bCs/>
+              </w:rPr>
+              <w:t>Process #:</w:t>
+            </w:r>
+          </w:p>
+        </w:tc>
+        <w:tc>
+          <w:tcPr>
+            <w:tcW w:w="7015" w:type="dxa"/>
+          </w:tcPr>
+          <w:p>
+            <w:pPr>
+              <w:rPr>
+                <w:rFonts w:ascii="Times New Roman" w:hAnsi="Times New Roman" w:cs="Times New Roman"/>
+              </w:rPr>
+            </w:pPr>
+            <w:r>
+              <w:rPr>
+                <w:rFonts w:ascii="Times New Roman" w:hAnsi="Times New Roman" w:cs="Times New Roman"/>
+              </w:rPr>
+              <w:t>5</w:t>
+            </w:r>
+          </w:p>
+        </w:tc>
+      </w:tr>
+      <w:tr>
+        <w:tc>
+          <w:tcPr>
+            <w:tcW w:w="2335" w:type="dxa"/>
+          </w:tcPr>
+          <w:p>
+            <w:pPr>
+              <w:rPr>
+                <w:rFonts w:ascii="Times New Roman" w:hAnsi="Times New Roman" w:cs="Times New Roman"/>
+                <w:b/>
+                <w:bCs/>
+              </w:rPr>
+            </w:pPr>
+            <w:r>
+              <w:rPr>
+                <w:rFonts w:ascii="Times New Roman" w:hAnsi="Times New Roman" w:cs="Times New Roman"/>
+                <w:b/>
+                <w:bCs/>
+              </w:rPr>
+              <w:t>Process Description:</w:t>
+            </w:r>
+          </w:p>
+        </w:tc>
+        <w:tc>
+          <w:tcPr>
+            <w:tcW w:w="7015" w:type="dxa"/>
+          </w:tcPr>
+          <w:p>
+            <w:pPr>
+              <w:rPr>
+                <w:rFonts w:ascii="Times New Roman" w:hAnsi="Times New Roman" w:cs="Times New Roman"/>
+              </w:rPr>
+            </w:pPr>
+            <w:r>
+              <w:rPr>
+                <w:rFonts w:ascii="Times New Roman" w:hAnsi="Times New Roman" w:cs="Times New Roman"/>
+              </w:rPr>
+              <w:t>Input Data Flows:</w:t>
+            </w:r>
+          </w:p>
+          <w:p>
+            <w:pPr>
+              <w:pStyle w:val="ListParagraph"/>
+              <w:numPr>
+                <w:ilvl w:val="0"/>
+                <w:numId w:val="15"/>
+              </w:numPr>
+              <w:rPr>
+                <w:rFonts w:ascii="Times New Roman" w:hAnsi="Times New Roman" w:cs="Times New Roman"/>
+              </w:rPr>
+            </w:pPr>
+            <w:r>
+              <w:rPr>
+                <w:rFonts w:ascii="Times New Roman" w:hAnsi="Times New Roman" w:cs="Times New Roman"/>
+              </w:rPr>
+              <w:t>CSV EXPORT FILE</w:t>
+            </w:r>
+          </w:p>
+          <w:p>
+            <w:pPr>
+              <w:rPr>
+                <w:rFonts w:ascii="Times New Roman" w:hAnsi="Times New Roman" w:cs="Times New Roman"/>
+              </w:rPr>
+            </w:pPr>
+            <w:r>
+              <w:rPr>
+                <w:rFonts w:ascii="Times New Roman" w:hAnsi="Times New Roman" w:cs="Times New Roman"/>
+              </w:rPr>
+              <w:t>Output Data Flows:</w:t>
+            </w:r>
+          </w:p>
+          <w:p>
+            <w:pPr>
+              <w:pStyle w:val="ListParagraph"/>
+              <w:numPr>
+                <w:ilvl w:val="0"/>
+                <w:numId w:val="16"/>
+              </w:numPr>
+              <w:rPr>
+                <w:rFonts w:ascii="Times New Roman" w:hAnsi="Times New Roman" w:cs="Times New Roman"/>
+              </w:rPr>
+            </w:pPr>
+            <w:r>
+              <w:rPr>
+                <w:rFonts w:ascii="Times New Roman" w:hAnsi="Times New Roman" w:cs="Times New Roman"/>
+              </w:rPr>
+              <w:t>IMPORTED CSV FILE</w:t>
+            </w:r>
+          </w:p>
+          <w:p>
+            <w:pPr>
+              <w:rPr>
+                <w:rFonts w:ascii="Times New Roman" w:hAnsi="Times New Roman" w:cs="Times New Roman"/>
+              </w:rPr>
+            </w:pPr>
+            <w:r>
+              <w:rPr>
+                <w:rFonts w:ascii="Times New Roman" w:hAnsi="Times New Roman" w:cs="Times New Roman"/>
+              </w:rPr>
+              <w:t xml:space="preserve">RECEIVE the </w:t>
+            </w:r>
+            <w:r>
+              <w:rPr>
+                <w:rFonts w:ascii="Times New Roman" w:hAnsi="Times New Roman" w:cs="Times New Roman"/>
+              </w:rPr>
+              <w:t xml:space="preserve">CSV EXPORT FILE from </w:t>
+            </w:r>
+            <w:proofErr w:type="gramStart"/>
+            <w:r>
+              <w:rPr>
+                <w:rFonts w:ascii="Times New Roman" w:hAnsi="Times New Roman" w:cs="Times New Roman"/>
+              </w:rPr>
+              <w:t>the LEGACY</w:t>
+            </w:r>
+            <w:proofErr w:type="gramEnd"/>
+            <w:r>
+              <w:rPr>
+                <w:rFonts w:ascii="Times New Roman" w:hAnsi="Times New Roman" w:cs="Times New Roman"/>
+              </w:rPr>
+              <w:t xml:space="preserve"> DATA SOURCE.</w:t>
+            </w:r>
+          </w:p>
+          <w:p>
+            <w:pPr>
+              <w:rPr>
+                <w:rFonts w:ascii="Times New Roman" w:hAnsi="Times New Roman" w:cs="Times New Roman"/>
+              </w:rPr>
+            </w:pPr>
+          </w:p>
+          <w:p>
+            <w:pPr>
+              <w:rPr>
+                <w:rFonts w:ascii="Times New Roman" w:hAnsi="Times New Roman" w:cs="Times New Roman"/>
+              </w:rPr>
+            </w:pPr>
+            <w:r>
+              <w:rPr>
+                <w:rFonts w:ascii="Times New Roman" w:hAnsi="Times New Roman" w:cs="Times New Roman"/>
+              </w:rPr>
+              <w:t xml:space="preserve">SEND the </w:t>
+            </w:r>
+            <w:r>
+              <w:rPr>
+                <w:rFonts w:ascii="Times New Roman" w:hAnsi="Times New Roman" w:cs="Times New Roman"/>
+              </w:rPr>
+              <w:t>IMPORTED CSV FILE to the PRODUCTION DATA DATABASE.</w:t>
+            </w:r>
+          </w:p>
+        </w:tc>
+      </w:tr>
+      <w:tr>
+        <w:tc>
+          <w:tcPr>
+            <w:tcW w:w="2335" w:type="dxa"/>
+          </w:tcPr>
+          <w:p>
+            <w:pPr>
+              <w:rPr>
+                <w:rFonts w:ascii="Times New Roman" w:hAnsi="Times New Roman" w:cs="Times New Roman"/>
+                <w:b/>
+                <w:bCs/>
+              </w:rPr>
+            </w:pPr>
+            <w:r>
+              <w:rPr>
+                <w:rFonts w:ascii="Times New Roman" w:hAnsi="Times New Roman" w:cs="Times New Roman"/>
+                <w:b/>
+                <w:bCs/>
+              </w:rPr>
+              <w:t>Notes:</w:t>
+            </w:r>
+          </w:p>
+        </w:tc>
+        <w:tc>
+          <w:tcPr>
+            <w:tcW w:w="7015" w:type="dxa"/>
+          </w:tcPr>
+          <w:p>
+            <w:pPr>
+              <w:rPr>
+                <w:rFonts w:ascii="Times New Roman" w:hAnsi="Times New Roman" w:cs="Times New Roman"/>
+              </w:rPr>
+            </w:pPr>
+            <w:r>
+              <w:rPr>
+                <w:rFonts w:ascii="Times New Roman" w:hAnsi="Times New Roman" w:cs="Times New Roman"/>
+              </w:rPr>
+              <w:t>.CSV file to be imported using MySQL DBMS import utility for record transfer.</w:t>
+            </w:r>
+          </w:p>
+        </w:tc>
+      </w:tr>
+    </w:tbl>
+    <w:p>
+      <w:pPr>
+        <w:spacing w:after="0" w:line="240" w:lineRule="auto"/>
+        <w:jc w:val="center"/>
+        <w:rPr>
+          <w:rFonts w:ascii="Times New Roman" w:hAnsi="Times New Roman" w:cs="Times New Roman"/>
+          <w:b/>
+          <w:bCs/>
+        </w:rPr>
+      </w:pPr>
+    </w:p>
+    <w:p>
+      <w:pPr>
+        <w:spacing w:after="0" w:line="240" w:lineRule="auto"/>
+        <w:jc w:val="center"/>
+        <w:rPr>
+          <w:rFonts w:ascii="Times New Roman" w:hAnsi="Times New Roman" w:cs="Times New Roman"/>
+          <w:b/>
+          <w:bCs/>
+        </w:rPr>
+      </w:pPr>
+    </w:p>
+    <w:p>
+      <w:pPr>
+        <w:spacing w:after="0" w:line="240" w:lineRule="auto"/>
+        <w:jc w:val="center"/>
+        <w:rPr>
+          <w:rFonts w:ascii="Times New Roman" w:hAnsi="Times New Roman" w:cs="Times New Roman"/>
+          <w:b/>
+          <w:bCs/>
+        </w:rPr>
+      </w:pPr>
+    </w:p>
+    <w:p>
+      <w:pPr>
+        <w:spacing w:after="0" w:line="240" w:lineRule="auto"/>
+        <w:jc w:val="center"/>
+        <w:rPr>
+          <w:rFonts w:ascii="Times New Roman" w:hAnsi="Times New Roman" w:cs="Times New Roman"/>
+          <w:b/>
+          <w:bCs/>
+        </w:rPr>
+      </w:pPr>
+    </w:p>
+    <w:p>
+      <w:pPr>
+        <w:spacing w:after="0" w:line="240" w:lineRule="auto"/>
+        <w:jc w:val="center"/>
+        <w:rPr>
+          <w:rFonts w:ascii="Times New Roman" w:hAnsi="Times New Roman" w:cs="Times New Roman"/>
+          <w:b/>
+          <w:bCs/>
+        </w:rPr>
+      </w:pPr>
+    </w:p>
+    <w:p>
+      <w:pPr>
+        <w:spacing w:after="0" w:line="240" w:lineRule="auto"/>
+        <w:jc w:val="center"/>
+        <w:rPr>
+          <w:rFonts w:ascii="Times New Roman" w:hAnsi="Times New Roman" w:cs="Times New Roman"/>
+          <w:b/>
+          <w:bCs/>
+        </w:rPr>
+      </w:pPr>
+    </w:p>
+    <w:p>
+      <w:pPr>
+        <w:spacing w:after="0" w:line="240" w:lineRule="auto"/>
+        <w:jc w:val="center"/>
+        <w:rPr>
+          <w:rFonts w:ascii="Times New Roman" w:hAnsi="Times New Roman" w:cs="Times New Roman"/>
+          <w:b/>
+          <w:bCs/>
+        </w:rPr>
+      </w:pPr>
+    </w:p>
+    <w:p>
+      <w:pPr>
+        <w:spacing w:after="0" w:line="240" w:lineRule="auto"/>
+        <w:jc w:val="center"/>
+        <w:rPr>
+          <w:rFonts w:ascii="Times New Roman" w:hAnsi="Times New Roman" w:cs="Times New Roman"/>
+          <w:b/>
+          <w:bCs/>
+        </w:rPr>
+      </w:pPr>
+    </w:p>
+    <w:p>
+      <w:pPr>
+        <w:spacing w:after="0" w:line="240" w:lineRule="auto"/>
+        <w:jc w:val="center"/>
+        <w:rPr>
+          <w:rFonts w:ascii="Times New Roman" w:hAnsi="Times New Roman" w:cs="Times New Roman"/>
+          <w:b/>
+          <w:bCs/>
+        </w:rPr>
+      </w:pPr>
+    </w:p>
+    <w:p>
+      <w:pPr>
+        <w:spacing w:after="0" w:line="240" w:lineRule="auto"/>
+        <w:jc w:val="center"/>
+        <w:rPr>
+          <w:rFonts w:ascii="Times New Roman" w:hAnsi="Times New Roman" w:cs="Times New Roman"/>
+          <w:b/>
+          <w:bCs/>
+        </w:rPr>
+      </w:pPr>
+    </w:p>
+    <w:p>
+      <w:pPr>
+        <w:spacing w:after="0" w:line="240" w:lineRule="auto"/>
+        <w:jc w:val="center"/>
+        <w:rPr>
+          <w:rFonts w:ascii="Times New Roman" w:hAnsi="Times New Roman" w:cs="Times New Roman"/>
+          <w:b/>
+          <w:bCs/>
+        </w:rPr>
+      </w:pPr>
+    </w:p>
+    <w:tbl>
+      <w:tblPr>
+        <w:tblStyle w:val="TableGrid"/>
+        <w:tblW w:w="0" w:type="auto"/>
+        <w:tblLook w:val="04A0" w:firstRow="1" w:lastRow="0" w:firstColumn="1" w:lastColumn="0" w:noHBand="0" w:noVBand="1"/>
+      </w:tblPr>
+      <w:tblGrid>
+        <w:gridCol w:w="2335"/>
+        <w:gridCol w:w="7015"/>
+      </w:tblGrid>
+      <w:tr>
+        <w:tc>
+          <w:tcPr>
+            <w:tcW w:w="2335" w:type="dxa"/>
+          </w:tcPr>
+          <w:p>
+            <w:pPr>
+              <w:rPr>
+                <w:rFonts w:ascii="Times New Roman" w:hAnsi="Times New Roman" w:cs="Times New Roman"/>
+                <w:b/>
+                <w:bCs/>
+              </w:rPr>
+            </w:pPr>
+            <w:r>
+              <w:rPr>
+                <w:rFonts w:ascii="Times New Roman" w:hAnsi="Times New Roman" w:cs="Times New Roman"/>
+                <w:b/>
+                <w:bCs/>
+              </w:rPr>
+              <w:lastRenderedPageBreak/>
+              <w:t>Label:</w:t>
+            </w:r>
+          </w:p>
+        </w:tc>
+        <w:tc>
+          <w:tcPr>
+            <w:tcW w:w="7015" w:type="dxa"/>
+          </w:tcPr>
+          <w:p>
+            <w:pPr>
+              <w:rPr>
+                <w:rFonts w:ascii="Times New Roman" w:hAnsi="Times New Roman" w:cs="Times New Roman"/>
+              </w:rPr>
+            </w:pPr>
+            <w:r>
+              <w:rPr>
+                <w:rFonts w:ascii="Times New Roman" w:hAnsi="Times New Roman" w:cs="Times New Roman"/>
+              </w:rPr>
+              <w:t>BACKUP &amp; RESTORE SCHEDULER</w:t>
+            </w:r>
+          </w:p>
+        </w:tc>
+      </w:tr>
+      <w:tr>
+        <w:tc>
+          <w:tcPr>
+            <w:tcW w:w="2335" w:type="dxa"/>
+          </w:tcPr>
+          <w:p>
+            <w:pPr>
+              <w:rPr>
+                <w:rFonts w:ascii="Times New Roman" w:hAnsi="Times New Roman" w:cs="Times New Roman"/>
+                <w:b/>
+                <w:bCs/>
+              </w:rPr>
+            </w:pPr>
+            <w:r>
+              <w:rPr>
+                <w:rFonts w:ascii="Times New Roman" w:hAnsi="Times New Roman" w:cs="Times New Roman"/>
+                <w:b/>
+                <w:bCs/>
+              </w:rPr>
+              <w:t>Entry Type:</w:t>
+            </w:r>
+          </w:p>
+        </w:tc>
+        <w:tc>
+          <w:tcPr>
+            <w:tcW w:w="7015" w:type="dxa"/>
+          </w:tcPr>
+          <w:p>
+            <w:pPr>
+              <w:rPr>
+                <w:rFonts w:ascii="Times New Roman" w:hAnsi="Times New Roman" w:cs="Times New Roman"/>
+              </w:rPr>
+            </w:pPr>
+            <w:r>
+              <w:rPr>
+                <w:rFonts w:ascii="Times New Roman" w:hAnsi="Times New Roman" w:cs="Times New Roman"/>
+              </w:rPr>
+              <w:t>Process</w:t>
+            </w:r>
+          </w:p>
+        </w:tc>
+      </w:tr>
+      <w:tr>
+        <w:tc>
+          <w:tcPr>
+            <w:tcW w:w="2335" w:type="dxa"/>
+          </w:tcPr>
+          <w:p>
+            <w:pPr>
+              <w:rPr>
+                <w:rFonts w:ascii="Times New Roman" w:hAnsi="Times New Roman" w:cs="Times New Roman"/>
+                <w:b/>
+                <w:bCs/>
+              </w:rPr>
+            </w:pPr>
+            <w:r>
+              <w:rPr>
+                <w:rFonts w:ascii="Times New Roman" w:hAnsi="Times New Roman" w:cs="Times New Roman"/>
+                <w:b/>
+                <w:bCs/>
+              </w:rPr>
+              <w:t>Description:</w:t>
+            </w:r>
+          </w:p>
+        </w:tc>
+        <w:tc>
+          <w:tcPr>
+            <w:tcW w:w="7015" w:type="dxa"/>
+          </w:tcPr>
+          <w:p>
+            <w:pPr>
+              <w:rPr>
+                <w:rFonts w:ascii="Times New Roman" w:hAnsi="Times New Roman" w:cs="Times New Roman"/>
+              </w:rPr>
+            </w:pPr>
+            <w:r>
+              <w:rPr>
+                <w:rFonts w:ascii="Times New Roman" w:hAnsi="Times New Roman" w:cs="Times New Roman"/>
+              </w:rPr>
+              <w:t xml:space="preserve">Create </w:t>
+            </w:r>
+            <w:proofErr w:type="spellStart"/>
+            <w:r>
+              <w:rPr>
+                <w:rFonts w:ascii="Times New Roman" w:hAnsi="Times New Roman" w:cs="Times New Roman"/>
+              </w:rPr>
+              <w:t>MySQLDump</w:t>
+            </w:r>
+            <w:proofErr w:type="spellEnd"/>
+            <w:r>
+              <w:rPr>
+                <w:rFonts w:ascii="Times New Roman" w:hAnsi="Times New Roman" w:cs="Times New Roman"/>
+              </w:rPr>
+              <w:t xml:space="preserve"> files </w:t>
+            </w:r>
+            <w:r>
+              <w:rPr>
+                <w:rFonts w:ascii="Times New Roman" w:hAnsi="Times New Roman" w:cs="Times New Roman"/>
+              </w:rPr>
+              <w:t>as</w:t>
+            </w:r>
+            <w:r>
+              <w:rPr>
+                <w:rFonts w:ascii="Times New Roman" w:hAnsi="Times New Roman" w:cs="Times New Roman"/>
+              </w:rPr>
+              <w:t xml:space="preserve"> backup copies for Database restoration </w:t>
+            </w:r>
+            <w:r>
+              <w:rPr>
+                <w:rFonts w:ascii="Times New Roman" w:hAnsi="Times New Roman" w:cs="Times New Roman"/>
+              </w:rPr>
+              <w:t>on a nightly schedule</w:t>
+            </w:r>
+            <w:r>
+              <w:rPr>
+                <w:rFonts w:ascii="Times New Roman" w:hAnsi="Times New Roman" w:cs="Times New Roman"/>
+              </w:rPr>
+              <w:t xml:space="preserve"> </w:t>
+            </w:r>
+            <w:r>
+              <w:rPr>
+                <w:rFonts w:ascii="Times New Roman" w:hAnsi="Times New Roman" w:cs="Times New Roman"/>
+              </w:rPr>
+              <w:t xml:space="preserve">in the event of hardware or software failure. </w:t>
+            </w:r>
+          </w:p>
+        </w:tc>
+      </w:tr>
+      <w:tr>
+        <w:tc>
+          <w:tcPr>
+            <w:tcW w:w="2335" w:type="dxa"/>
+          </w:tcPr>
+          <w:p>
+            <w:pPr>
+              <w:rPr>
+                <w:rFonts w:ascii="Times New Roman" w:hAnsi="Times New Roman" w:cs="Times New Roman"/>
+                <w:b/>
+                <w:bCs/>
+              </w:rPr>
+            </w:pPr>
+            <w:r>
+              <w:rPr>
+                <w:rFonts w:ascii="Times New Roman" w:hAnsi="Times New Roman" w:cs="Times New Roman"/>
+                <w:b/>
+                <w:bCs/>
+              </w:rPr>
+              <w:t>Process #:</w:t>
+            </w:r>
+          </w:p>
+        </w:tc>
+        <w:tc>
+          <w:tcPr>
+            <w:tcW w:w="7015" w:type="dxa"/>
+          </w:tcPr>
+          <w:p>
+            <w:pPr>
+              <w:rPr>
+                <w:rFonts w:ascii="Times New Roman" w:hAnsi="Times New Roman" w:cs="Times New Roman"/>
+              </w:rPr>
+            </w:pPr>
+            <w:r>
+              <w:rPr>
+                <w:rFonts w:ascii="Times New Roman" w:hAnsi="Times New Roman" w:cs="Times New Roman"/>
+              </w:rPr>
+              <w:t>6</w:t>
+            </w:r>
+          </w:p>
+        </w:tc>
+      </w:tr>
+      <w:tr>
+        <w:tc>
+          <w:tcPr>
+            <w:tcW w:w="2335" w:type="dxa"/>
+          </w:tcPr>
+          <w:p>
+            <w:pPr>
+              <w:rPr>
+                <w:rFonts w:ascii="Times New Roman" w:hAnsi="Times New Roman" w:cs="Times New Roman"/>
+                <w:b/>
+                <w:bCs/>
+              </w:rPr>
+            </w:pPr>
+            <w:r>
+              <w:rPr>
+                <w:rFonts w:ascii="Times New Roman" w:hAnsi="Times New Roman" w:cs="Times New Roman"/>
+                <w:b/>
+                <w:bCs/>
+              </w:rPr>
+              <w:t>Process Description:</w:t>
+            </w:r>
+          </w:p>
+        </w:tc>
+        <w:tc>
+          <w:tcPr>
+            <w:tcW w:w="7015" w:type="dxa"/>
+          </w:tcPr>
+          <w:p>
+            <w:pPr>
+              <w:rPr>
+                <w:rFonts w:ascii="Times New Roman" w:hAnsi="Times New Roman" w:cs="Times New Roman"/>
+              </w:rPr>
+            </w:pPr>
+            <w:r>
+              <w:rPr>
+                <w:rFonts w:ascii="Times New Roman" w:hAnsi="Times New Roman" w:cs="Times New Roman"/>
+              </w:rPr>
+              <w:t>Input Data Flows:</w:t>
+            </w:r>
+          </w:p>
+          <w:p>
+            <w:pPr>
+              <w:pStyle w:val="ListParagraph"/>
+              <w:numPr>
+                <w:ilvl w:val="0"/>
+                <w:numId w:val="17"/>
+              </w:numPr>
+              <w:rPr>
+                <w:rFonts w:ascii="Times New Roman" w:hAnsi="Times New Roman" w:cs="Times New Roman"/>
+              </w:rPr>
+            </w:pPr>
+            <w:r>
+              <w:rPr>
+                <w:rFonts w:ascii="Times New Roman" w:hAnsi="Times New Roman" w:cs="Times New Roman"/>
+              </w:rPr>
+              <w:t>DB IMAGE WITH BACKUP DATA</w:t>
+            </w:r>
+          </w:p>
+          <w:p>
+            <w:pPr>
+              <w:rPr>
+                <w:rFonts w:ascii="Times New Roman" w:hAnsi="Times New Roman" w:cs="Times New Roman"/>
+              </w:rPr>
+            </w:pPr>
+            <w:r>
+              <w:rPr>
+                <w:rFonts w:ascii="Times New Roman" w:hAnsi="Times New Roman" w:cs="Times New Roman"/>
+              </w:rPr>
+              <w:t>Output Data Flows:</w:t>
+            </w:r>
+          </w:p>
+          <w:p>
+            <w:pPr>
+              <w:pStyle w:val="ListParagraph"/>
+              <w:numPr>
+                <w:ilvl w:val="0"/>
+                <w:numId w:val="18"/>
+              </w:numPr>
+              <w:rPr>
+                <w:rFonts w:ascii="Times New Roman" w:hAnsi="Times New Roman" w:cs="Times New Roman"/>
+              </w:rPr>
+            </w:pPr>
+            <w:r>
+              <w:rPr>
+                <w:rFonts w:ascii="Times New Roman" w:hAnsi="Times New Roman" w:cs="Times New Roman"/>
+              </w:rPr>
+              <w:t>DB BACKUP FILE</w:t>
+            </w:r>
+          </w:p>
+          <w:p>
+            <w:pPr>
+              <w:rPr>
+                <w:rFonts w:ascii="Times New Roman" w:hAnsi="Times New Roman" w:cs="Times New Roman"/>
+              </w:rPr>
+            </w:pPr>
+            <w:r>
+              <w:rPr>
+                <w:rFonts w:ascii="Times New Roman" w:hAnsi="Times New Roman" w:cs="Times New Roman"/>
+              </w:rPr>
+              <w:t xml:space="preserve">RECEIVE the </w:t>
+            </w:r>
+            <w:r>
+              <w:rPr>
+                <w:rFonts w:ascii="Times New Roman" w:hAnsi="Times New Roman" w:cs="Times New Roman"/>
+              </w:rPr>
+              <w:t>DB IMAGE WITH BACKUP DATA from the PRODUCTION DATA DATABASE.</w:t>
+            </w:r>
+          </w:p>
+          <w:p>
+            <w:pPr>
+              <w:rPr>
+                <w:rFonts w:ascii="Times New Roman" w:hAnsi="Times New Roman" w:cs="Times New Roman"/>
+              </w:rPr>
+            </w:pPr>
+          </w:p>
+          <w:p>
+            <w:pPr>
+              <w:rPr>
+                <w:rFonts w:ascii="Times New Roman" w:hAnsi="Times New Roman" w:cs="Times New Roman"/>
+              </w:rPr>
+            </w:pPr>
+            <w:r>
+              <w:rPr>
+                <w:rFonts w:ascii="Times New Roman" w:hAnsi="Times New Roman" w:cs="Times New Roman"/>
+              </w:rPr>
+              <w:t xml:space="preserve">SEND the </w:t>
+            </w:r>
+            <w:r>
+              <w:rPr>
+                <w:rFonts w:ascii="Times New Roman" w:hAnsi="Times New Roman" w:cs="Times New Roman"/>
+              </w:rPr>
+              <w:t>DB BACKUP FILE to the BACKUP ARCHIVE.</w:t>
+            </w:r>
+          </w:p>
+        </w:tc>
+      </w:tr>
+      <w:tr>
+        <w:tc>
+          <w:tcPr>
+            <w:tcW w:w="2335" w:type="dxa"/>
+          </w:tcPr>
+          <w:p>
+            <w:pPr>
+              <w:rPr>
+                <w:rFonts w:ascii="Times New Roman" w:hAnsi="Times New Roman" w:cs="Times New Roman"/>
+                <w:b/>
+                <w:bCs/>
+              </w:rPr>
+            </w:pPr>
+            <w:r>
+              <w:rPr>
+                <w:rFonts w:ascii="Times New Roman" w:hAnsi="Times New Roman" w:cs="Times New Roman"/>
+                <w:b/>
+                <w:bCs/>
+              </w:rPr>
+              <w:t>Notes:</w:t>
+            </w:r>
+          </w:p>
+        </w:tc>
+        <w:tc>
+          <w:tcPr>
+            <w:tcW w:w="7015" w:type="dxa"/>
+          </w:tcPr>
+          <w:p>
+            <w:pPr>
+              <w:rPr>
+                <w:rFonts w:ascii="Times New Roman" w:hAnsi="Times New Roman" w:cs="Times New Roman"/>
+              </w:rPr>
+            </w:pPr>
+            <w:r>
+              <w:rPr>
+                <w:rFonts w:ascii="Times New Roman" w:hAnsi="Times New Roman" w:cs="Times New Roman"/>
+              </w:rPr>
+              <w:t xml:space="preserve">The BACKUP ARCHIVE will be a directory on the </w:t>
+            </w:r>
+            <w:proofErr w:type="gramStart"/>
+            <w:r>
+              <w:rPr>
+                <w:rFonts w:ascii="Times New Roman" w:hAnsi="Times New Roman" w:cs="Times New Roman"/>
+              </w:rPr>
+              <w:t>servers</w:t>
+            </w:r>
+            <w:proofErr w:type="gramEnd"/>
+            <w:r>
+              <w:rPr>
+                <w:rFonts w:ascii="Times New Roman" w:hAnsi="Times New Roman" w:cs="Times New Roman"/>
+              </w:rPr>
+              <w:t xml:space="preserve"> storage device dedicated to storing copies of the DB BACKUP FILE for future retrieval and restoration needs if necessary.</w:t>
             </w:r>
           </w:p>
         </w:tc>
@@ -2561,6 +4020,95 @@
     </w:lvl>
   </w:abstractNum>
   <w:abstractNum w:abstractNumId="1" w15:restartNumberingAfterBreak="0">
+    <w:nsid w:val="0D842AFE"/>
+    <w:multiLevelType w:val="hybridMultilevel"/>
+    <w:tmpl w:val="F6828976"/>
+    <w:lvl w:ilvl="0" w:tplc="D36C7414">
+      <w:start w:val="1"/>
+      <w:numFmt w:val="decimal"/>
+      <w:lvlText w:val="%1)"/>
+      <w:lvlJc w:val="left"/>
+      <w:pPr>
+        <w:ind w:left="720" w:hanging="360"/>
+      </w:pPr>
+      <w:rPr>
+        <w:rFonts w:hint="default"/>
+      </w:rPr>
+    </w:lvl>
+    <w:lvl w:ilvl="1" w:tplc="04090019" w:tentative="1">
+      <w:start w:val="1"/>
+      <w:numFmt w:val="lowerLetter"/>
+      <w:lvlText w:val="%2."/>
+      <w:lvlJc w:val="left"/>
+      <w:pPr>
+        <w:ind w:left="1440" w:hanging="360"/>
+      </w:pPr>
+    </w:lvl>
+    <w:lvl w:ilvl="2" w:tplc="0409001B" w:tentative="1">
+      <w:start w:val="1"/>
+      <w:numFmt w:val="lowerRoman"/>
+      <w:lvlText w:val="%3."/>
+      <w:lvlJc w:val="right"/>
+      <w:pPr>
+        <w:ind w:left="2160" w:hanging="180"/>
+      </w:pPr>
+    </w:lvl>
+    <w:lvl w:ilvl="3" w:tplc="0409000F" w:tentative="1">
+      <w:start w:val="1"/>
+      <w:numFmt w:val="decimal"/>
+      <w:lvlText w:val="%4."/>
+      <w:lvlJc w:val="left"/>
+      <w:pPr>
+        <w:ind w:left="2880" w:hanging="360"/>
+      </w:pPr>
+    </w:lvl>
+    <w:lvl w:ilvl="4" w:tplc="04090019" w:tentative="1">
+      <w:start w:val="1"/>
+      <w:numFmt w:val="lowerLetter"/>
+      <w:lvlText w:val="%5."/>
+      <w:lvlJc w:val="left"/>
+      <w:pPr>
+        <w:ind w:left="3600" w:hanging="360"/>
+      </w:pPr>
+    </w:lvl>
+    <w:lvl w:ilvl="5" w:tplc="0409001B" w:tentative="1">
+      <w:start w:val="1"/>
+      <w:numFmt w:val="lowerRoman"/>
+      <w:lvlText w:val="%6."/>
+      <w:lvlJc w:val="right"/>
+      <w:pPr>
+        <w:ind w:left="4320" w:hanging="180"/>
+      </w:pPr>
+    </w:lvl>
+    <w:lvl w:ilvl="6" w:tplc="0409000F" w:tentative="1">
+      <w:start w:val="1"/>
+      <w:numFmt w:val="decimal"/>
+      <w:lvlText w:val="%7."/>
+      <w:lvlJc w:val="left"/>
+      <w:pPr>
+        <w:ind w:left="5040" w:hanging="360"/>
+      </w:pPr>
+    </w:lvl>
+    <w:lvl w:ilvl="7" w:tplc="04090019" w:tentative="1">
+      <w:start w:val="1"/>
+      <w:numFmt w:val="lowerLetter"/>
+      <w:lvlText w:val="%8."/>
+      <w:lvlJc w:val="left"/>
+      <w:pPr>
+        <w:ind w:left="5760" w:hanging="360"/>
+      </w:pPr>
+    </w:lvl>
+    <w:lvl w:ilvl="8" w:tplc="0409001B" w:tentative="1">
+      <w:start w:val="1"/>
+      <w:numFmt w:val="lowerRoman"/>
+      <w:lvlText w:val="%9."/>
+      <w:lvlJc w:val="right"/>
+      <w:pPr>
+        <w:ind w:left="6480" w:hanging="180"/>
+      </w:pPr>
+    </w:lvl>
+  </w:abstractNum>
+  <w:abstractNum w:abstractNumId="2" w15:restartNumberingAfterBreak="0">
     <w:nsid w:val="120C0E6C"/>
     <w:multiLevelType w:val="hybridMultilevel"/>
     <w:tmpl w:val="0D3040EA"/>
@@ -2649,7 +4197,274 @@
       </w:pPr>
     </w:lvl>
   </w:abstractNum>
-  <w:abstractNum w:abstractNumId="2" w15:restartNumberingAfterBreak="0">
+  <w:abstractNum w:abstractNumId="3" w15:restartNumberingAfterBreak="0">
+    <w:nsid w:val="15341002"/>
+    <w:multiLevelType w:val="hybridMultilevel"/>
+    <w:tmpl w:val="BA5009E6"/>
+    <w:lvl w:ilvl="0" w:tplc="9238EEEC">
+      <w:start w:val="1"/>
+      <w:numFmt w:val="decimal"/>
+      <w:lvlText w:val="%1)"/>
+      <w:lvlJc w:val="left"/>
+      <w:pPr>
+        <w:ind w:left="720" w:hanging="360"/>
+      </w:pPr>
+      <w:rPr>
+        <w:rFonts w:hint="default"/>
+      </w:rPr>
+    </w:lvl>
+    <w:lvl w:ilvl="1" w:tplc="04090019" w:tentative="1">
+      <w:start w:val="1"/>
+      <w:numFmt w:val="lowerLetter"/>
+      <w:lvlText w:val="%2."/>
+      <w:lvlJc w:val="left"/>
+      <w:pPr>
+        <w:ind w:left="1440" w:hanging="360"/>
+      </w:pPr>
+    </w:lvl>
+    <w:lvl w:ilvl="2" w:tplc="0409001B" w:tentative="1">
+      <w:start w:val="1"/>
+      <w:numFmt w:val="lowerRoman"/>
+      <w:lvlText w:val="%3."/>
+      <w:lvlJc w:val="right"/>
+      <w:pPr>
+        <w:ind w:left="2160" w:hanging="180"/>
+      </w:pPr>
+    </w:lvl>
+    <w:lvl w:ilvl="3" w:tplc="0409000F" w:tentative="1">
+      <w:start w:val="1"/>
+      <w:numFmt w:val="decimal"/>
+      <w:lvlText w:val="%4."/>
+      <w:lvlJc w:val="left"/>
+      <w:pPr>
+        <w:ind w:left="2880" w:hanging="360"/>
+      </w:pPr>
+    </w:lvl>
+    <w:lvl w:ilvl="4" w:tplc="04090019" w:tentative="1">
+      <w:start w:val="1"/>
+      <w:numFmt w:val="lowerLetter"/>
+      <w:lvlText w:val="%5."/>
+      <w:lvlJc w:val="left"/>
+      <w:pPr>
+        <w:ind w:left="3600" w:hanging="360"/>
+      </w:pPr>
+    </w:lvl>
+    <w:lvl w:ilvl="5" w:tplc="0409001B" w:tentative="1">
+      <w:start w:val="1"/>
+      <w:numFmt w:val="lowerRoman"/>
+      <w:lvlText w:val="%6."/>
+      <w:lvlJc w:val="right"/>
+      <w:pPr>
+        <w:ind w:left="4320" w:hanging="180"/>
+      </w:pPr>
+    </w:lvl>
+    <w:lvl w:ilvl="6" w:tplc="0409000F" w:tentative="1">
+      <w:start w:val="1"/>
+      <w:numFmt w:val="decimal"/>
+      <w:lvlText w:val="%7."/>
+      <w:lvlJc w:val="left"/>
+      <w:pPr>
+        <w:ind w:left="5040" w:hanging="360"/>
+      </w:pPr>
+    </w:lvl>
+    <w:lvl w:ilvl="7" w:tplc="04090019" w:tentative="1">
+      <w:start w:val="1"/>
+      <w:numFmt w:val="lowerLetter"/>
+      <w:lvlText w:val="%8."/>
+      <w:lvlJc w:val="left"/>
+      <w:pPr>
+        <w:ind w:left="5760" w:hanging="360"/>
+      </w:pPr>
+    </w:lvl>
+    <w:lvl w:ilvl="8" w:tplc="0409001B" w:tentative="1">
+      <w:start w:val="1"/>
+      <w:numFmt w:val="lowerRoman"/>
+      <w:lvlText w:val="%9."/>
+      <w:lvlJc w:val="right"/>
+      <w:pPr>
+        <w:ind w:left="6480" w:hanging="180"/>
+      </w:pPr>
+    </w:lvl>
+  </w:abstractNum>
+  <w:abstractNum w:abstractNumId="4" w15:restartNumberingAfterBreak="0">
+    <w:nsid w:val="2BC73327"/>
+    <w:multiLevelType w:val="hybridMultilevel"/>
+    <w:tmpl w:val="4EC2E430"/>
+    <w:lvl w:ilvl="0" w:tplc="9CC47680">
+      <w:start w:val="1"/>
+      <w:numFmt w:val="decimal"/>
+      <w:lvlText w:val="%1)"/>
+      <w:lvlJc w:val="left"/>
+      <w:pPr>
+        <w:ind w:left="720" w:hanging="360"/>
+      </w:pPr>
+      <w:rPr>
+        <w:rFonts w:hint="default"/>
+      </w:rPr>
+    </w:lvl>
+    <w:lvl w:ilvl="1" w:tplc="04090019" w:tentative="1">
+      <w:start w:val="1"/>
+      <w:numFmt w:val="lowerLetter"/>
+      <w:lvlText w:val="%2."/>
+      <w:lvlJc w:val="left"/>
+      <w:pPr>
+        <w:ind w:left="1440" w:hanging="360"/>
+      </w:pPr>
+    </w:lvl>
+    <w:lvl w:ilvl="2" w:tplc="0409001B" w:tentative="1">
+      <w:start w:val="1"/>
+      <w:numFmt w:val="lowerRoman"/>
+      <w:lvlText w:val="%3."/>
+      <w:lvlJc w:val="right"/>
+      <w:pPr>
+        <w:ind w:left="2160" w:hanging="180"/>
+      </w:pPr>
+    </w:lvl>
+    <w:lvl w:ilvl="3" w:tplc="0409000F" w:tentative="1">
+      <w:start w:val="1"/>
+      <w:numFmt w:val="decimal"/>
+      <w:lvlText w:val="%4."/>
+      <w:lvlJc w:val="left"/>
+      <w:pPr>
+        <w:ind w:left="2880" w:hanging="360"/>
+      </w:pPr>
+    </w:lvl>
+    <w:lvl w:ilvl="4" w:tplc="04090019" w:tentative="1">
+      <w:start w:val="1"/>
+      <w:numFmt w:val="lowerLetter"/>
+      <w:lvlText w:val="%5."/>
+      <w:lvlJc w:val="left"/>
+      <w:pPr>
+        <w:ind w:left="3600" w:hanging="360"/>
+      </w:pPr>
+    </w:lvl>
+    <w:lvl w:ilvl="5" w:tplc="0409001B" w:tentative="1">
+      <w:start w:val="1"/>
+      <w:numFmt w:val="lowerRoman"/>
+      <w:lvlText w:val="%6."/>
+      <w:lvlJc w:val="right"/>
+      <w:pPr>
+        <w:ind w:left="4320" w:hanging="180"/>
+      </w:pPr>
+    </w:lvl>
+    <w:lvl w:ilvl="6" w:tplc="0409000F" w:tentative="1">
+      <w:start w:val="1"/>
+      <w:numFmt w:val="decimal"/>
+      <w:lvlText w:val="%7."/>
+      <w:lvlJc w:val="left"/>
+      <w:pPr>
+        <w:ind w:left="5040" w:hanging="360"/>
+      </w:pPr>
+    </w:lvl>
+    <w:lvl w:ilvl="7" w:tplc="04090019" w:tentative="1">
+      <w:start w:val="1"/>
+      <w:numFmt w:val="lowerLetter"/>
+      <w:lvlText w:val="%8."/>
+      <w:lvlJc w:val="left"/>
+      <w:pPr>
+        <w:ind w:left="5760" w:hanging="360"/>
+      </w:pPr>
+    </w:lvl>
+    <w:lvl w:ilvl="8" w:tplc="0409001B" w:tentative="1">
+      <w:start w:val="1"/>
+      <w:numFmt w:val="lowerRoman"/>
+      <w:lvlText w:val="%9."/>
+      <w:lvlJc w:val="right"/>
+      <w:pPr>
+        <w:ind w:left="6480" w:hanging="180"/>
+      </w:pPr>
+    </w:lvl>
+  </w:abstractNum>
+  <w:abstractNum w:abstractNumId="5" w15:restartNumberingAfterBreak="0">
+    <w:nsid w:val="2DA25ADE"/>
+    <w:multiLevelType w:val="hybridMultilevel"/>
+    <w:tmpl w:val="6456C05E"/>
+    <w:lvl w:ilvl="0" w:tplc="17244640">
+      <w:start w:val="1"/>
+      <w:numFmt w:val="decimal"/>
+      <w:lvlText w:val="%1)"/>
+      <w:lvlJc w:val="left"/>
+      <w:pPr>
+        <w:ind w:left="720" w:hanging="360"/>
+      </w:pPr>
+      <w:rPr>
+        <w:rFonts w:hint="default"/>
+      </w:rPr>
+    </w:lvl>
+    <w:lvl w:ilvl="1" w:tplc="04090019" w:tentative="1">
+      <w:start w:val="1"/>
+      <w:numFmt w:val="lowerLetter"/>
+      <w:lvlText w:val="%2."/>
+      <w:lvlJc w:val="left"/>
+      <w:pPr>
+        <w:ind w:left="1440" w:hanging="360"/>
+      </w:pPr>
+    </w:lvl>
+    <w:lvl w:ilvl="2" w:tplc="0409001B" w:tentative="1">
+      <w:start w:val="1"/>
+      <w:numFmt w:val="lowerRoman"/>
+      <w:lvlText w:val="%3."/>
+      <w:lvlJc w:val="right"/>
+      <w:pPr>
+        <w:ind w:left="2160" w:hanging="180"/>
+      </w:pPr>
+    </w:lvl>
+    <w:lvl w:ilvl="3" w:tplc="0409000F" w:tentative="1">
+      <w:start w:val="1"/>
+      <w:numFmt w:val="decimal"/>
+      <w:lvlText w:val="%4."/>
+      <w:lvlJc w:val="left"/>
+      <w:pPr>
+        <w:ind w:left="2880" w:hanging="360"/>
+      </w:pPr>
+    </w:lvl>
+    <w:lvl w:ilvl="4" w:tplc="04090019" w:tentative="1">
+      <w:start w:val="1"/>
+      <w:numFmt w:val="lowerLetter"/>
+      <w:lvlText w:val="%5."/>
+      <w:lvlJc w:val="left"/>
+      <w:pPr>
+        <w:ind w:left="3600" w:hanging="360"/>
+      </w:pPr>
+    </w:lvl>
+    <w:lvl w:ilvl="5" w:tplc="0409001B" w:tentative="1">
+      <w:start w:val="1"/>
+      <w:numFmt w:val="lowerRoman"/>
+      <w:lvlText w:val="%6."/>
+      <w:lvlJc w:val="right"/>
+      <w:pPr>
+        <w:ind w:left="4320" w:hanging="180"/>
+      </w:pPr>
+    </w:lvl>
+    <w:lvl w:ilvl="6" w:tplc="0409000F" w:tentative="1">
+      <w:start w:val="1"/>
+      <w:numFmt w:val="decimal"/>
+      <w:lvlText w:val="%7."/>
+      <w:lvlJc w:val="left"/>
+      <w:pPr>
+        <w:ind w:left="5040" w:hanging="360"/>
+      </w:pPr>
+    </w:lvl>
+    <w:lvl w:ilvl="7" w:tplc="04090019" w:tentative="1">
+      <w:start w:val="1"/>
+      <w:numFmt w:val="lowerLetter"/>
+      <w:lvlText w:val="%8."/>
+      <w:lvlJc w:val="left"/>
+      <w:pPr>
+        <w:ind w:left="5760" w:hanging="360"/>
+      </w:pPr>
+    </w:lvl>
+    <w:lvl w:ilvl="8" w:tplc="0409001B" w:tentative="1">
+      <w:start w:val="1"/>
+      <w:numFmt w:val="lowerRoman"/>
+      <w:lvlText w:val="%9."/>
+      <w:lvlJc w:val="right"/>
+      <w:pPr>
+        <w:ind w:left="6480" w:hanging="180"/>
+      </w:pPr>
+    </w:lvl>
+  </w:abstractNum>
+  <w:abstractNum w:abstractNumId="6" w15:restartNumberingAfterBreak="0">
     <w:nsid w:val="337378D0"/>
     <w:multiLevelType w:val="hybridMultilevel"/>
     <w:tmpl w:val="5560BCA4"/>
@@ -2738,7 +4553,7 @@
       </w:pPr>
     </w:lvl>
   </w:abstractNum>
-  <w:abstractNum w:abstractNumId="3" w15:restartNumberingAfterBreak="0">
+  <w:abstractNum w:abstractNumId="7" w15:restartNumberingAfterBreak="0">
     <w:nsid w:val="3AF62589"/>
     <w:multiLevelType w:val="hybridMultilevel"/>
     <w:tmpl w:val="6AA0EB7C"/>
@@ -2827,7 +4642,7 @@
       </w:pPr>
     </w:lvl>
   </w:abstractNum>
-  <w:abstractNum w:abstractNumId="4" w15:restartNumberingAfterBreak="0">
+  <w:abstractNum w:abstractNumId="8" w15:restartNumberingAfterBreak="0">
     <w:nsid w:val="47CE6AE0"/>
     <w:multiLevelType w:val="hybridMultilevel"/>
     <w:tmpl w:val="CFF45F36"/>
@@ -2916,7 +4731,7 @@
       </w:pPr>
     </w:lvl>
   </w:abstractNum>
-  <w:abstractNum w:abstractNumId="5" w15:restartNumberingAfterBreak="0">
+  <w:abstractNum w:abstractNumId="9" w15:restartNumberingAfterBreak="0">
     <w:nsid w:val="4850614B"/>
     <w:multiLevelType w:val="hybridMultilevel"/>
     <w:tmpl w:val="7BBA32A4"/>
@@ -3005,7 +4820,7 @@
       </w:pPr>
     </w:lvl>
   </w:abstractNum>
-  <w:abstractNum w:abstractNumId="6" w15:restartNumberingAfterBreak="0">
+  <w:abstractNum w:abstractNumId="10" w15:restartNumberingAfterBreak="0">
     <w:nsid w:val="4AFE3CF9"/>
     <w:multiLevelType w:val="hybridMultilevel"/>
     <w:tmpl w:val="3CD2D4F0"/>
@@ -3117,7 +4932,7 @@
       </w:rPr>
     </w:lvl>
   </w:abstractNum>
-  <w:abstractNum w:abstractNumId="7" w15:restartNumberingAfterBreak="0">
+  <w:abstractNum w:abstractNumId="11" w15:restartNumberingAfterBreak="0">
     <w:nsid w:val="4D5D3D97"/>
     <w:multiLevelType w:val="hybridMultilevel"/>
     <w:tmpl w:val="52108F0E"/>
@@ -3206,7 +5021,96 @@
       </w:pPr>
     </w:lvl>
   </w:abstractNum>
-  <w:abstractNum w:abstractNumId="8" w15:restartNumberingAfterBreak="0">
+  <w:abstractNum w:abstractNumId="12" w15:restartNumberingAfterBreak="0">
+    <w:nsid w:val="53691F64"/>
+    <w:multiLevelType w:val="hybridMultilevel"/>
+    <w:tmpl w:val="D618F4BE"/>
+    <w:lvl w:ilvl="0" w:tplc="25BE31B4">
+      <w:start w:val="1"/>
+      <w:numFmt w:val="decimal"/>
+      <w:lvlText w:val="%1)"/>
+      <w:lvlJc w:val="left"/>
+      <w:pPr>
+        <w:ind w:left="720" w:hanging="360"/>
+      </w:pPr>
+      <w:rPr>
+        <w:rFonts w:hint="default"/>
+      </w:rPr>
+    </w:lvl>
+    <w:lvl w:ilvl="1" w:tplc="04090019" w:tentative="1">
+      <w:start w:val="1"/>
+      <w:numFmt w:val="lowerLetter"/>
+      <w:lvlText w:val="%2."/>
+      <w:lvlJc w:val="left"/>
+      <w:pPr>
+        <w:ind w:left="1440" w:hanging="360"/>
+      </w:pPr>
+    </w:lvl>
+    <w:lvl w:ilvl="2" w:tplc="0409001B" w:tentative="1">
+      <w:start w:val="1"/>
+      <w:numFmt w:val="lowerRoman"/>
+      <w:lvlText w:val="%3."/>
+      <w:lvlJc w:val="right"/>
+      <w:pPr>
+        <w:ind w:left="2160" w:hanging="180"/>
+      </w:pPr>
+    </w:lvl>
+    <w:lvl w:ilvl="3" w:tplc="0409000F" w:tentative="1">
+      <w:start w:val="1"/>
+      <w:numFmt w:val="decimal"/>
+      <w:lvlText w:val="%4."/>
+      <w:lvlJc w:val="left"/>
+      <w:pPr>
+        <w:ind w:left="2880" w:hanging="360"/>
+      </w:pPr>
+    </w:lvl>
+    <w:lvl w:ilvl="4" w:tplc="04090019" w:tentative="1">
+      <w:start w:val="1"/>
+      <w:numFmt w:val="lowerLetter"/>
+      <w:lvlText w:val="%5."/>
+      <w:lvlJc w:val="left"/>
+      <w:pPr>
+        <w:ind w:left="3600" w:hanging="360"/>
+      </w:pPr>
+    </w:lvl>
+    <w:lvl w:ilvl="5" w:tplc="0409001B" w:tentative="1">
+      <w:start w:val="1"/>
+      <w:numFmt w:val="lowerRoman"/>
+      <w:lvlText w:val="%6."/>
+      <w:lvlJc w:val="right"/>
+      <w:pPr>
+        <w:ind w:left="4320" w:hanging="180"/>
+      </w:pPr>
+    </w:lvl>
+    <w:lvl w:ilvl="6" w:tplc="0409000F" w:tentative="1">
+      <w:start w:val="1"/>
+      <w:numFmt w:val="decimal"/>
+      <w:lvlText w:val="%7."/>
+      <w:lvlJc w:val="left"/>
+      <w:pPr>
+        <w:ind w:left="5040" w:hanging="360"/>
+      </w:pPr>
+    </w:lvl>
+    <w:lvl w:ilvl="7" w:tplc="04090019" w:tentative="1">
+      <w:start w:val="1"/>
+      <w:numFmt w:val="lowerLetter"/>
+      <w:lvlText w:val="%8."/>
+      <w:lvlJc w:val="left"/>
+      <w:pPr>
+        <w:ind w:left="5760" w:hanging="360"/>
+      </w:pPr>
+    </w:lvl>
+    <w:lvl w:ilvl="8" w:tplc="0409001B" w:tentative="1">
+      <w:start w:val="1"/>
+      <w:numFmt w:val="lowerRoman"/>
+      <w:lvlText w:val="%9."/>
+      <w:lvlJc w:val="right"/>
+      <w:pPr>
+        <w:ind w:left="6480" w:hanging="180"/>
+      </w:pPr>
+    </w:lvl>
+  </w:abstractNum>
+  <w:abstractNum w:abstractNumId="13" w15:restartNumberingAfterBreak="0">
     <w:nsid w:val="59100608"/>
     <w:multiLevelType w:val="hybridMultilevel"/>
     <w:tmpl w:val="F4305EC6"/>
@@ -3295,7 +5199,208 @@
       </w:pPr>
     </w:lvl>
   </w:abstractNum>
-  <w:abstractNum w:abstractNumId="9" w15:restartNumberingAfterBreak="0">
+  <w:abstractNum w:abstractNumId="14" w15:restartNumberingAfterBreak="0">
+    <w:nsid w:val="6637067C"/>
+    <w:multiLevelType w:val="hybridMultilevel"/>
+    <w:tmpl w:val="F2CC3346"/>
+    <w:lvl w:ilvl="0" w:tplc="B61CF588">
+      <w:numFmt w:val="bullet"/>
+      <w:lvlText w:val="-"/>
+      <w:lvlJc w:val="left"/>
+      <w:pPr>
+        <w:ind w:left="720" w:hanging="360"/>
+      </w:pPr>
+      <w:rPr>
+        <w:rFonts w:ascii="Times New Roman" w:eastAsiaTheme="minorHAnsi" w:hAnsi="Times New Roman" w:cs="Times New Roman" w:hint="default"/>
+      </w:rPr>
+    </w:lvl>
+    <w:lvl w:ilvl="1" w:tplc="04090003" w:tentative="1">
+      <w:start w:val="1"/>
+      <w:numFmt w:val="bullet"/>
+      <w:lvlText w:val="o"/>
+      <w:lvlJc w:val="left"/>
+      <w:pPr>
+        <w:ind w:left="1440" w:hanging="360"/>
+      </w:pPr>
+      <w:rPr>
+        <w:rFonts w:ascii="Courier New" w:hAnsi="Courier New" w:cs="Courier New" w:hint="default"/>
+      </w:rPr>
+    </w:lvl>
+    <w:lvl w:ilvl="2" w:tplc="04090005" w:tentative="1">
+      <w:start w:val="1"/>
+      <w:numFmt w:val="bullet"/>
+      <w:lvlText w:val=""/>
+      <w:lvlJc w:val="left"/>
+      <w:pPr>
+        <w:ind w:left="2160" w:hanging="360"/>
+      </w:pPr>
+      <w:rPr>
+        <w:rFonts w:ascii="Wingdings" w:hAnsi="Wingdings" w:hint="default"/>
+      </w:rPr>
+    </w:lvl>
+    <w:lvl w:ilvl="3" w:tplc="04090001" w:tentative="1">
+      <w:start w:val="1"/>
+      <w:numFmt w:val="bullet"/>
+      <w:lvlText w:val=""/>
+      <w:lvlJc w:val="left"/>
+      <w:pPr>
+        <w:ind w:left="2880" w:hanging="360"/>
+      </w:pPr>
+      <w:rPr>
+        <w:rFonts w:ascii="Symbol" w:hAnsi="Symbol" w:hint="default"/>
+      </w:rPr>
+    </w:lvl>
+    <w:lvl w:ilvl="4" w:tplc="04090003" w:tentative="1">
+      <w:start w:val="1"/>
+      <w:numFmt w:val="bullet"/>
+      <w:lvlText w:val="o"/>
+      <w:lvlJc w:val="left"/>
+      <w:pPr>
+        <w:ind w:left="3600" w:hanging="360"/>
+      </w:pPr>
+      <w:rPr>
+        <w:rFonts w:ascii="Courier New" w:hAnsi="Courier New" w:cs="Courier New" w:hint="default"/>
+      </w:rPr>
+    </w:lvl>
+    <w:lvl w:ilvl="5" w:tplc="04090005" w:tentative="1">
+      <w:start w:val="1"/>
+      <w:numFmt w:val="bullet"/>
+      <w:lvlText w:val=""/>
+      <w:lvlJc w:val="left"/>
+      <w:pPr>
+        <w:ind w:left="4320" w:hanging="360"/>
+      </w:pPr>
+      <w:rPr>
+        <w:rFonts w:ascii="Wingdings" w:hAnsi="Wingdings" w:hint="default"/>
+      </w:rPr>
+    </w:lvl>
+    <w:lvl w:ilvl="6" w:tplc="04090001" w:tentative="1">
+      <w:start w:val="1"/>
+      <w:numFmt w:val="bullet"/>
+      <w:lvlText w:val=""/>
+      <w:lvlJc w:val="left"/>
+      <w:pPr>
+        <w:ind w:left="5040" w:hanging="360"/>
+      </w:pPr>
+      <w:rPr>
+        <w:rFonts w:ascii="Symbol" w:hAnsi="Symbol" w:hint="default"/>
+      </w:rPr>
+    </w:lvl>
+    <w:lvl w:ilvl="7" w:tplc="04090003" w:tentative="1">
+      <w:start w:val="1"/>
+      <w:numFmt w:val="bullet"/>
+      <w:lvlText w:val="o"/>
+      <w:lvlJc w:val="left"/>
+      <w:pPr>
+        <w:ind w:left="5760" w:hanging="360"/>
+      </w:pPr>
+      <w:rPr>
+        <w:rFonts w:ascii="Courier New" w:hAnsi="Courier New" w:cs="Courier New" w:hint="default"/>
+      </w:rPr>
+    </w:lvl>
+    <w:lvl w:ilvl="8" w:tplc="04090005" w:tentative="1">
+      <w:start w:val="1"/>
+      <w:numFmt w:val="bullet"/>
+      <w:lvlText w:val=""/>
+      <w:lvlJc w:val="left"/>
+      <w:pPr>
+        <w:ind w:left="6480" w:hanging="360"/>
+      </w:pPr>
+      <w:rPr>
+        <w:rFonts w:ascii="Wingdings" w:hAnsi="Wingdings" w:hint="default"/>
+      </w:rPr>
+    </w:lvl>
+  </w:abstractNum>
+  <w:abstractNum w:abstractNumId="15" w15:restartNumberingAfterBreak="0">
+    <w:nsid w:val="745D5E5A"/>
+    <w:multiLevelType w:val="hybridMultilevel"/>
+    <w:tmpl w:val="CD8AD11A"/>
+    <w:lvl w:ilvl="0" w:tplc="C05C012E">
+      <w:start w:val="1"/>
+      <w:numFmt w:val="decimal"/>
+      <w:lvlText w:val="%1)"/>
+      <w:lvlJc w:val="left"/>
+      <w:pPr>
+        <w:ind w:left="720" w:hanging="360"/>
+      </w:pPr>
+      <w:rPr>
+        <w:rFonts w:hint="default"/>
+      </w:rPr>
+    </w:lvl>
+    <w:lvl w:ilvl="1" w:tplc="04090019" w:tentative="1">
+      <w:start w:val="1"/>
+      <w:numFmt w:val="lowerLetter"/>
+      <w:lvlText w:val="%2."/>
+      <w:lvlJc w:val="left"/>
+      <w:pPr>
+        <w:ind w:left="1440" w:hanging="360"/>
+      </w:pPr>
+    </w:lvl>
+    <w:lvl w:ilvl="2" w:tplc="0409001B" w:tentative="1">
+      <w:start w:val="1"/>
+      <w:numFmt w:val="lowerRoman"/>
+      <w:lvlText w:val="%3."/>
+      <w:lvlJc w:val="right"/>
+      <w:pPr>
+        <w:ind w:left="2160" w:hanging="180"/>
+      </w:pPr>
+    </w:lvl>
+    <w:lvl w:ilvl="3" w:tplc="0409000F" w:tentative="1">
+      <w:start w:val="1"/>
+      <w:numFmt w:val="decimal"/>
+      <w:lvlText w:val="%4."/>
+      <w:lvlJc w:val="left"/>
+      <w:pPr>
+        <w:ind w:left="2880" w:hanging="360"/>
+      </w:pPr>
+    </w:lvl>
+    <w:lvl w:ilvl="4" w:tplc="04090019" w:tentative="1">
+      <w:start w:val="1"/>
+      <w:numFmt w:val="lowerLetter"/>
+      <w:lvlText w:val="%5."/>
+      <w:lvlJc w:val="left"/>
+      <w:pPr>
+        <w:ind w:left="3600" w:hanging="360"/>
+      </w:pPr>
+    </w:lvl>
+    <w:lvl w:ilvl="5" w:tplc="0409001B" w:tentative="1">
+      <w:start w:val="1"/>
+      <w:numFmt w:val="lowerRoman"/>
+      <w:lvlText w:val="%6."/>
+      <w:lvlJc w:val="right"/>
+      <w:pPr>
+        <w:ind w:left="4320" w:hanging="180"/>
+      </w:pPr>
+    </w:lvl>
+    <w:lvl w:ilvl="6" w:tplc="0409000F" w:tentative="1">
+      <w:start w:val="1"/>
+      <w:numFmt w:val="decimal"/>
+      <w:lvlText w:val="%7."/>
+      <w:lvlJc w:val="left"/>
+      <w:pPr>
+        <w:ind w:left="5040" w:hanging="360"/>
+      </w:pPr>
+    </w:lvl>
+    <w:lvl w:ilvl="7" w:tplc="04090019" w:tentative="1">
+      <w:start w:val="1"/>
+      <w:numFmt w:val="lowerLetter"/>
+      <w:lvlText w:val="%8."/>
+      <w:lvlJc w:val="left"/>
+      <w:pPr>
+        <w:ind w:left="5760" w:hanging="360"/>
+      </w:pPr>
+    </w:lvl>
+    <w:lvl w:ilvl="8" w:tplc="0409001B" w:tentative="1">
+      <w:start w:val="1"/>
+      <w:numFmt w:val="lowerRoman"/>
+      <w:lvlText w:val="%9."/>
+      <w:lvlJc w:val="right"/>
+      <w:pPr>
+        <w:ind w:left="6480" w:hanging="180"/>
+      </w:pPr>
+    </w:lvl>
+  </w:abstractNum>
+  <w:abstractNum w:abstractNumId="16" w15:restartNumberingAfterBreak="0">
     <w:nsid w:val="74F40D4F"/>
     <w:multiLevelType w:val="hybridMultilevel"/>
     <w:tmpl w:val="60D2BE9A"/>
@@ -3384,7 +5489,7 @@
       </w:pPr>
     </w:lvl>
   </w:abstractNum>
-  <w:abstractNum w:abstractNumId="10" w15:restartNumberingAfterBreak="0">
+  <w:abstractNum w:abstractNumId="17" w15:restartNumberingAfterBreak="0">
     <w:nsid w:val="792837CF"/>
     <w:multiLevelType w:val="hybridMultilevel"/>
     <w:tmpl w:val="72DA6FC8"/>
@@ -3474,37 +5579,58 @@
     </w:lvl>
   </w:abstractNum>
   <w:num w:numId="1" w16cid:durableId="1913849408">
+    <w:abstractNumId w:val="13"/>
+  </w:num>
+  <w:num w:numId="2" w16cid:durableId="590506055">
+    <w:abstractNumId w:val="6"/>
+  </w:num>
+  <w:num w:numId="3" w16cid:durableId="1449860507">
     <w:abstractNumId w:val="8"/>
   </w:num>
-  <w:num w:numId="2" w16cid:durableId="590506055">
-    <w:abstractNumId w:val="2"/>
+  <w:num w:numId="4" w16cid:durableId="344334215">
+    <w:abstractNumId w:val="11"/>
   </w:num>
-  <w:num w:numId="3" w16cid:durableId="1449860507">
-    <w:abstractNumId w:val="4"/>
+  <w:num w:numId="5" w16cid:durableId="967055277">
+    <w:abstractNumId w:val="17"/>
   </w:num>
-  <w:num w:numId="4" w16cid:durableId="344334215">
+  <w:num w:numId="6" w16cid:durableId="1622300038">
+    <w:abstractNumId w:val="9"/>
+  </w:num>
+  <w:num w:numId="7" w16cid:durableId="1433823824">
     <w:abstractNumId w:val="7"/>
   </w:num>
-  <w:num w:numId="5" w16cid:durableId="967055277">
-    <w:abstractNumId w:val="10"/>
-  </w:num>
-  <w:num w:numId="6" w16cid:durableId="1622300038">
-    <w:abstractNumId w:val="5"/>
-  </w:num>
-  <w:num w:numId="7" w16cid:durableId="1433823824">
-    <w:abstractNumId w:val="3"/>
-  </w:num>
   <w:num w:numId="8" w16cid:durableId="1395660194">
-    <w:abstractNumId w:val="1"/>
+    <w:abstractNumId w:val="2"/>
   </w:num>
   <w:num w:numId="9" w16cid:durableId="1480922289">
     <w:abstractNumId w:val="0"/>
   </w:num>
   <w:num w:numId="10" w16cid:durableId="655299545">
-    <w:abstractNumId w:val="9"/>
+    <w:abstractNumId w:val="16"/>
   </w:num>
   <w:num w:numId="11" w16cid:durableId="1990010514">
-    <w:abstractNumId w:val="6"/>
+    <w:abstractNumId w:val="10"/>
+  </w:num>
+  <w:num w:numId="12" w16cid:durableId="2022076238">
+    <w:abstractNumId w:val="14"/>
+  </w:num>
+  <w:num w:numId="13" w16cid:durableId="783614699">
+    <w:abstractNumId w:val="4"/>
+  </w:num>
+  <w:num w:numId="14" w16cid:durableId="1599680878">
+    <w:abstractNumId w:val="1"/>
+  </w:num>
+  <w:num w:numId="15" w16cid:durableId="1650549184">
+    <w:abstractNumId w:val="12"/>
+  </w:num>
+  <w:num w:numId="16" w16cid:durableId="1628587542">
+    <w:abstractNumId w:val="15"/>
+  </w:num>
+  <w:num w:numId="17" w16cid:durableId="1441872683">
+    <w:abstractNumId w:val="3"/>
+  </w:num>
+  <w:num w:numId="18" w16cid:durableId="1299530346">
+    <w:abstractNumId w:val="5"/>
   </w:num>
 </w:numbering>
 </file>

</xml_diff>